<commit_message>
feat(reveal): integrate full Reveal Math desktop documents into unit browser, lesson desk, and download manifest
</commit_message>
<xml_diff>
--- a/curriculum/reveal-documents/shared/teacher/fluency-skills-by-lesson.docx
+++ b/curriculum/reveal-documents/shared/teacher/fluency-skills-by-lesson.docx
@@ -5,7 +5,7 @@
     <w:p>
       <w:pPr>
         <w:keepNext/>
-        <w:spacing w:after="20"/>
+        <w:spacing w:after="0"/>
       </w:pPr>
       <w:r>
         <w:rPr>
@@ -22,7 +22,7 @@
     <w:p>
       <w:pPr>
         <w:keepNext/>
-        <w:spacing w:after="40" w:line="240" w:lineRule="auto"/>
+        <w:spacing w:after="0" w:line="240" w:lineRule="auto"/>
       </w:pPr>
       <w:r>
         <w:rPr>
@@ -36,7 +36,7 @@
     <w:p>
       <w:pPr>
         <w:keepNext/>
-        <w:spacing w:after="100" w:line="264" w:lineRule="auto"/>
+        <w:spacing w:after="0" w:line="240" w:lineRule="auto"/>
       </w:pPr>
       <w:r>
         <w:rPr>
@@ -52,12 +52,12 @@
         <w:pBdr>
           <w:bottom w:val="single" w:sz="4" w:space="5" w:color="C9CDD2"/>
         </w:pBdr>
-        <w:spacing w:after="160" w:line="264" w:lineRule="auto"/>
+        <w:spacing w:after="0" w:line="240" w:lineRule="auto"/>
       </w:pPr>
     </w:p>
     <w:p>
       <w:pPr>
-        <w:spacing w:after="90" w:line="264" w:lineRule="auto"/>
+        <w:spacing w:after="0" w:line="240" w:lineRule="auto"/>
       </w:pPr>
       <w:r>
         <w:rPr>
@@ -103,7 +103,7 @@
         <w:tabs>
           <w:tab w:val="right" w:pos="9504"/>
         </w:tabs>
-        <w:spacing w:before="200" w:after="100" w:line="240" w:lineRule="auto"/>
+        <w:spacing w:before="0" w:after="0" w:line="240" w:lineRule="auto"/>
       </w:pPr>
       <w:r>
         <w:rPr>
@@ -132,7 +132,7 @@
       <w:pPr>
         <w:keepNext w:val="0"/>
         <w:keepLines w:val="1"/>
-        <w:spacing w:after="40" w:line="264" w:lineRule="auto"/>
+        <w:spacing w:after="0" w:line="240" w:lineRule="auto"/>
         <w:ind w:left="320" w:hanging="320"/>
       </w:pPr>
       <w:r>
@@ -157,7 +157,7 @@
       <w:pPr>
         <w:keepNext w:val="0"/>
         <w:keepLines w:val="1"/>
-        <w:spacing w:after="40" w:line="264" w:lineRule="auto"/>
+        <w:spacing w:after="0" w:line="240" w:lineRule="auto"/>
         <w:ind w:left="320" w:hanging="320"/>
       </w:pPr>
       <w:r>
@@ -182,7 +182,7 @@
       <w:pPr>
         <w:keepNext w:val="1"/>
         <w:keepLines w:val="1"/>
-        <w:spacing w:after="40" w:line="264" w:lineRule="auto"/>
+        <w:spacing w:after="0" w:line="240" w:lineRule="auto"/>
         <w:ind w:left="320" w:hanging="320"/>
       </w:pPr>
       <w:r>
@@ -213,7 +213,7 @@
         <w:tabs>
           <w:tab w:val="right" w:pos="9504"/>
         </w:tabs>
-        <w:spacing w:before="200" w:after="100" w:line="240" w:lineRule="auto"/>
+        <w:spacing w:before="0" w:after="0" w:line="240" w:lineRule="auto"/>
       </w:pPr>
       <w:r>
         <w:rPr>
@@ -345,7 +345,7 @@
           </w:tcPr>
           <w:p>
             <w:pPr>
-              <w:spacing w:after="0" w:line="246" w:lineRule="auto"/>
+              <w:spacing w:after="0" w:line="240" w:lineRule="auto"/>
             </w:pPr>
             <w:r>
               <w:rPr>
@@ -363,7 +363,7 @@
           </w:tcPr>
           <w:p>
             <w:pPr>
-              <w:spacing w:after="0" w:line="246" w:lineRule="auto"/>
+              <w:spacing w:after="0" w:line="240" w:lineRule="auto"/>
             </w:pPr>
             <w:r>
               <w:rPr>
@@ -381,7 +381,7 @@
           </w:tcPr>
           <w:p>
             <w:pPr>
-              <w:spacing w:after="0" w:line="246" w:lineRule="auto"/>
+              <w:spacing w:after="0" w:line="240" w:lineRule="auto"/>
             </w:pPr>
             <w:r>
               <w:rPr>
@@ -403,7 +403,7 @@
           </w:tcPr>
           <w:p>
             <w:pPr>
-              <w:spacing w:after="0" w:line="246" w:lineRule="auto"/>
+              <w:spacing w:after="0" w:line="240" w:lineRule="auto"/>
             </w:pPr>
             <w:r>
               <w:rPr>
@@ -421,7 +421,7 @@
           </w:tcPr>
           <w:p>
             <w:pPr>
-              <w:spacing w:after="0" w:line="246" w:lineRule="auto"/>
+              <w:spacing w:after="0" w:line="240" w:lineRule="auto"/>
             </w:pPr>
             <w:r>
               <w:rPr>
@@ -439,7 +439,7 @@
           </w:tcPr>
           <w:p>
             <w:pPr>
-              <w:spacing w:after="0" w:line="246" w:lineRule="auto"/>
+              <w:spacing w:after="0" w:line="240" w:lineRule="auto"/>
             </w:pPr>
             <w:r>
               <w:rPr>
@@ -461,7 +461,7 @@
           </w:tcPr>
           <w:p>
             <w:pPr>
-              <w:spacing w:after="0" w:line="246" w:lineRule="auto"/>
+              <w:spacing w:after="0" w:line="240" w:lineRule="auto"/>
             </w:pPr>
             <w:r>
               <w:rPr>
@@ -479,7 +479,7 @@
           </w:tcPr>
           <w:p>
             <w:pPr>
-              <w:spacing w:after="0" w:line="246" w:lineRule="auto"/>
+              <w:spacing w:after="0" w:line="240" w:lineRule="auto"/>
             </w:pPr>
             <w:r>
               <w:rPr>
@@ -497,7 +497,7 @@
           </w:tcPr>
           <w:p>
             <w:pPr>
-              <w:spacing w:after="0" w:line="246" w:lineRule="auto"/>
+              <w:spacing w:after="0" w:line="240" w:lineRule="auto"/>
             </w:pPr>
             <w:r>
               <w:rPr>
@@ -519,7 +519,7 @@
           </w:tcPr>
           <w:p>
             <w:pPr>
-              <w:spacing w:after="0" w:line="246" w:lineRule="auto"/>
+              <w:spacing w:after="0" w:line="240" w:lineRule="auto"/>
             </w:pPr>
             <w:r>
               <w:rPr>
@@ -537,7 +537,7 @@
           </w:tcPr>
           <w:p>
             <w:pPr>
-              <w:spacing w:after="0" w:line="246" w:lineRule="auto"/>
+              <w:spacing w:after="0" w:line="240" w:lineRule="auto"/>
             </w:pPr>
             <w:r>
               <w:rPr>
@@ -555,7 +555,7 @@
           </w:tcPr>
           <w:p>
             <w:pPr>
-              <w:spacing w:after="0" w:line="246" w:lineRule="auto"/>
+              <w:spacing w:after="0" w:line="240" w:lineRule="auto"/>
             </w:pPr>
             <w:r>
               <w:rPr>
@@ -577,7 +577,7 @@
           </w:tcPr>
           <w:p>
             <w:pPr>
-              <w:spacing w:after="0" w:line="246" w:lineRule="auto"/>
+              <w:spacing w:after="0" w:line="240" w:lineRule="auto"/>
             </w:pPr>
             <w:r>
               <w:rPr>
@@ -595,7 +595,7 @@
           </w:tcPr>
           <w:p>
             <w:pPr>
-              <w:spacing w:after="0" w:line="246" w:lineRule="auto"/>
+              <w:spacing w:after="0" w:line="240" w:lineRule="auto"/>
             </w:pPr>
             <w:r>
               <w:rPr>
@@ -613,7 +613,7 @@
           </w:tcPr>
           <w:p>
             <w:pPr>
-              <w:spacing w:after="0" w:line="246" w:lineRule="auto"/>
+              <w:spacing w:after="0" w:line="240" w:lineRule="auto"/>
             </w:pPr>
             <w:r>
               <w:rPr>
@@ -635,7 +635,7 @@
           </w:tcPr>
           <w:p>
             <w:pPr>
-              <w:spacing w:after="0" w:line="246" w:lineRule="auto"/>
+              <w:spacing w:after="0" w:line="240" w:lineRule="auto"/>
             </w:pPr>
             <w:r>
               <w:rPr>
@@ -653,7 +653,7 @@
           </w:tcPr>
           <w:p>
             <w:pPr>
-              <w:spacing w:after="0" w:line="246" w:lineRule="auto"/>
+              <w:spacing w:after="0" w:line="240" w:lineRule="auto"/>
             </w:pPr>
             <w:r>
               <w:rPr>
@@ -671,7 +671,7 @@
           </w:tcPr>
           <w:p>
             <w:pPr>
-              <w:spacing w:after="0" w:line="246" w:lineRule="auto"/>
+              <w:spacing w:after="0" w:line="240" w:lineRule="auto"/>
             </w:pPr>
             <w:r>
               <w:rPr>
@@ -693,7 +693,7 @@
           </w:tcPr>
           <w:p>
             <w:pPr>
-              <w:spacing w:after="0" w:line="246" w:lineRule="auto"/>
+              <w:spacing w:after="0" w:line="240" w:lineRule="auto"/>
             </w:pPr>
             <w:r>
               <w:rPr>
@@ -711,7 +711,7 @@
           </w:tcPr>
           <w:p>
             <w:pPr>
-              <w:spacing w:after="0" w:line="246" w:lineRule="auto"/>
+              <w:spacing w:after="0" w:line="240" w:lineRule="auto"/>
             </w:pPr>
             <w:r>
               <w:rPr>
@@ -729,7 +729,7 @@
           </w:tcPr>
           <w:p>
             <w:pPr>
-              <w:spacing w:after="0" w:line="246" w:lineRule="auto"/>
+              <w:spacing w:after="0" w:line="240" w:lineRule="auto"/>
             </w:pPr>
             <w:r>
               <w:rPr>
@@ -751,7 +751,7 @@
           </w:tcPr>
           <w:p>
             <w:pPr>
-              <w:spacing w:after="0" w:line="246" w:lineRule="auto"/>
+              <w:spacing w:after="0" w:line="240" w:lineRule="auto"/>
             </w:pPr>
             <w:r>
               <w:rPr>
@@ -769,7 +769,7 @@
           </w:tcPr>
           <w:p>
             <w:pPr>
-              <w:spacing w:after="0" w:line="246" w:lineRule="auto"/>
+              <w:spacing w:after="0" w:line="240" w:lineRule="auto"/>
             </w:pPr>
             <w:r>
               <w:rPr>
@@ -787,7 +787,7 @@
           </w:tcPr>
           <w:p>
             <w:pPr>
-              <w:spacing w:after="0" w:line="246" w:lineRule="auto"/>
+              <w:spacing w:after="0" w:line="240" w:lineRule="auto"/>
             </w:pPr>
             <w:r>
               <w:rPr>
@@ -809,7 +809,7 @@
           </w:tcPr>
           <w:p>
             <w:pPr>
-              <w:spacing w:after="0" w:line="246" w:lineRule="auto"/>
+              <w:spacing w:after="0" w:line="240" w:lineRule="auto"/>
             </w:pPr>
             <w:r>
               <w:rPr>
@@ -827,7 +827,7 @@
           </w:tcPr>
           <w:p>
             <w:pPr>
-              <w:spacing w:after="0" w:line="246" w:lineRule="auto"/>
+              <w:spacing w:after="0" w:line="240" w:lineRule="auto"/>
             </w:pPr>
             <w:r>
               <w:rPr>
@@ -845,7 +845,7 @@
           </w:tcPr>
           <w:p>
             <w:pPr>
-              <w:spacing w:after="0" w:line="246" w:lineRule="auto"/>
+              <w:spacing w:after="0" w:line="240" w:lineRule="auto"/>
             </w:pPr>
             <w:r>
               <w:rPr>
@@ -867,7 +867,7 @@
           </w:tcPr>
           <w:p>
             <w:pPr>
-              <w:spacing w:after="0" w:line="246" w:lineRule="auto"/>
+              <w:spacing w:after="0" w:line="240" w:lineRule="auto"/>
             </w:pPr>
             <w:r>
               <w:rPr>
@@ -885,7 +885,7 @@
           </w:tcPr>
           <w:p>
             <w:pPr>
-              <w:spacing w:after="0" w:line="246" w:lineRule="auto"/>
+              <w:spacing w:after="0" w:line="240" w:lineRule="auto"/>
             </w:pPr>
             <w:r>
               <w:rPr>
@@ -903,7 +903,7 @@
           </w:tcPr>
           <w:p>
             <w:pPr>
-              <w:spacing w:after="0" w:line="246" w:lineRule="auto"/>
+              <w:spacing w:after="0" w:line="240" w:lineRule="auto"/>
             </w:pPr>
             <w:r>
               <w:rPr>
@@ -925,7 +925,7 @@
           </w:tcPr>
           <w:p>
             <w:pPr>
-              <w:spacing w:after="0" w:line="246" w:lineRule="auto"/>
+              <w:spacing w:after="0" w:line="240" w:lineRule="auto"/>
             </w:pPr>
             <w:r>
               <w:rPr>
@@ -943,7 +943,7 @@
           </w:tcPr>
           <w:p>
             <w:pPr>
-              <w:spacing w:after="0" w:line="246" w:lineRule="auto"/>
+              <w:spacing w:after="0" w:line="240" w:lineRule="auto"/>
             </w:pPr>
             <w:r>
               <w:rPr>
@@ -961,7 +961,7 @@
           </w:tcPr>
           <w:p>
             <w:pPr>
-              <w:spacing w:after="0" w:line="246" w:lineRule="auto"/>
+              <w:spacing w:after="0" w:line="240" w:lineRule="auto"/>
             </w:pPr>
             <w:r>
               <w:rPr>
@@ -983,7 +983,7 @@
           </w:tcPr>
           <w:p>
             <w:pPr>
-              <w:spacing w:after="0" w:line="246" w:lineRule="auto"/>
+              <w:spacing w:after="0" w:line="240" w:lineRule="auto"/>
             </w:pPr>
             <w:r>
               <w:rPr>
@@ -1001,7 +1001,7 @@
           </w:tcPr>
           <w:p>
             <w:pPr>
-              <w:spacing w:after="0" w:line="246" w:lineRule="auto"/>
+              <w:spacing w:after="0" w:line="240" w:lineRule="auto"/>
             </w:pPr>
             <w:r>
               <w:rPr>
@@ -1019,7 +1019,7 @@
           </w:tcPr>
           <w:p>
             <w:pPr>
-              <w:spacing w:after="0" w:line="246" w:lineRule="auto"/>
+              <w:spacing w:after="0" w:line="240" w:lineRule="auto"/>
             </w:pPr>
             <w:r>
               <w:rPr>
@@ -1036,7 +1036,7 @@
       <w:pPr>
         <w:keepNext/>
         <w:pageBreakBefore/>
-        <w:spacing w:after="16"/>
+        <w:spacing w:after="0"/>
       </w:pPr>
       <w:r>
         <w:rPr>
@@ -1054,7 +1054,7 @@
     <w:p>
       <w:pPr>
         <w:keepNext/>
-        <w:spacing w:after="60" w:line="240" w:lineRule="auto"/>
+        <w:spacing w:after="0" w:line="240" w:lineRule="auto"/>
       </w:pPr>
       <w:r>
         <w:rPr>
@@ -1068,7 +1068,7 @@
     <w:p>
       <w:pPr>
         <w:keepNext/>
-        <w:spacing w:after="110" w:line="264" w:lineRule="auto"/>
+        <w:spacing w:after="0" w:line="240" w:lineRule="auto"/>
       </w:pPr>
       <w:r>
         <w:rPr>
@@ -1084,7 +1084,7 @@
         <w:pBdr>
           <w:bottom w:val="single" w:sz="4" w:space="5" w:color="C9CDD2"/>
         </w:pBdr>
-        <w:spacing w:after="150" w:line="264" w:lineRule="auto"/>
+        <w:spacing w:after="0" w:line="240" w:lineRule="auto"/>
       </w:pPr>
     </w:p>
     <w:tbl>
@@ -1194,7 +1194,7 @@
           </w:tcPr>
           <w:p>
             <w:pPr>
-              <w:spacing w:after="20" w:line="240" w:lineRule="auto"/>
+              <w:spacing w:after="0" w:line="240" w:lineRule="auto"/>
             </w:pPr>
             <w:r>
               <w:rPr>
@@ -1208,7 +1208,7 @@
           </w:p>
           <w:p>
             <w:pPr>
-              <w:spacing w:after="30" w:line="252" w:lineRule="auto"/>
+              <w:spacing w:after="0" w:line="240" w:lineRule="auto"/>
             </w:pPr>
             <w:r>
               <w:rPr>
@@ -1240,7 +1240,7 @@
           </w:tcPr>
           <w:p>
             <w:pPr>
-              <w:spacing w:after="40" w:line="252" w:lineRule="auto"/>
+              <w:spacing w:after="0" w:line="240" w:lineRule="auto"/>
               <w:ind w:left="250" w:hanging="250"/>
             </w:pPr>
             <w:r>
@@ -1273,7 +1273,7 @@
           </w:p>
           <w:p>
             <w:pPr>
-              <w:spacing w:after="40" w:line="252" w:lineRule="auto"/>
+              <w:spacing w:after="0" w:line="240" w:lineRule="auto"/>
               <w:ind w:left="250" w:hanging="250"/>
             </w:pPr>
             <w:r>
@@ -1306,7 +1306,7 @@
           </w:p>
           <w:p>
             <w:pPr>
-              <w:spacing w:after="40" w:line="252" w:lineRule="auto"/>
+              <w:spacing w:after="0" w:line="240" w:lineRule="auto"/>
               <w:ind w:left="250" w:hanging="250"/>
             </w:pPr>
             <w:r>
@@ -1339,7 +1339,7 @@
           </w:p>
           <w:p>
             <w:pPr>
-              <w:spacing w:after="0" w:line="252" w:lineRule="auto"/>
+              <w:spacing w:after="0" w:line="240" w:lineRule="auto"/>
               <w:ind w:left="250" w:hanging="250"/>
             </w:pPr>
             <w:r>
@@ -1377,7 +1377,7 @@
           </w:tcPr>
           <w:p>
             <w:pPr>
-              <w:spacing w:after="0" w:line="252" w:lineRule="auto"/>
+              <w:spacing w:after="0" w:line="240" w:lineRule="auto"/>
             </w:pPr>
             <w:r>
               <w:rPr>
@@ -1399,7 +1399,7 @@
           </w:tcPr>
           <w:p>
             <w:pPr>
-              <w:spacing w:after="20" w:line="240" w:lineRule="auto"/>
+              <w:spacing w:after="0" w:line="240" w:lineRule="auto"/>
             </w:pPr>
             <w:r>
               <w:rPr>
@@ -1413,7 +1413,7 @@
           </w:p>
           <w:p>
             <w:pPr>
-              <w:spacing w:after="30" w:line="252" w:lineRule="auto"/>
+              <w:spacing w:after="0" w:line="240" w:lineRule="auto"/>
             </w:pPr>
             <w:r>
               <w:rPr>
@@ -1445,7 +1445,7 @@
           </w:tcPr>
           <w:p>
             <w:pPr>
-              <w:spacing w:after="40" w:line="252" w:lineRule="auto"/>
+              <w:spacing w:after="0" w:line="240" w:lineRule="auto"/>
               <w:ind w:left="250" w:hanging="250"/>
             </w:pPr>
             <w:r>
@@ -1478,7 +1478,7 @@
           </w:p>
           <w:p>
             <w:pPr>
-              <w:spacing w:after="40" w:line="252" w:lineRule="auto"/>
+              <w:spacing w:after="0" w:line="240" w:lineRule="auto"/>
               <w:ind w:left="250" w:hanging="250"/>
             </w:pPr>
             <w:r>
@@ -1511,7 +1511,7 @@
           </w:p>
           <w:p>
             <w:pPr>
-              <w:spacing w:after="40" w:line="252" w:lineRule="auto"/>
+              <w:spacing w:after="0" w:line="240" w:lineRule="auto"/>
               <w:ind w:left="250" w:hanging="250"/>
             </w:pPr>
             <w:r>
@@ -1544,7 +1544,7 @@
           </w:p>
           <w:p>
             <w:pPr>
-              <w:spacing w:after="0" w:line="252" w:lineRule="auto"/>
+              <w:spacing w:after="0" w:line="240" w:lineRule="auto"/>
               <w:ind w:left="250" w:hanging="250"/>
             </w:pPr>
             <w:r>
@@ -1582,7 +1582,7 @@
           </w:tcPr>
           <w:p>
             <w:pPr>
-              <w:spacing w:after="0" w:line="252" w:lineRule="auto"/>
+              <w:spacing w:after="0" w:line="240" w:lineRule="auto"/>
             </w:pPr>
             <w:r>
               <w:rPr>
@@ -1604,7 +1604,7 @@
           </w:tcPr>
           <w:p>
             <w:pPr>
-              <w:spacing w:after="20" w:line="240" w:lineRule="auto"/>
+              <w:spacing w:after="0" w:line="240" w:lineRule="auto"/>
             </w:pPr>
             <w:r>
               <w:rPr>
@@ -1618,7 +1618,7 @@
           </w:p>
           <w:p>
             <w:pPr>
-              <w:spacing w:after="30" w:line="252" w:lineRule="auto"/>
+              <w:spacing w:after="0" w:line="240" w:lineRule="auto"/>
             </w:pPr>
             <w:r>
               <w:rPr>
@@ -1650,7 +1650,7 @@
           </w:tcPr>
           <w:p>
             <w:pPr>
-              <w:spacing w:after="40" w:line="252" w:lineRule="auto"/>
+              <w:spacing w:after="0" w:line="240" w:lineRule="auto"/>
               <w:ind w:left="250" w:hanging="250"/>
             </w:pPr>
             <w:r>
@@ -1683,7 +1683,7 @@
           </w:p>
           <w:p>
             <w:pPr>
-              <w:spacing w:after="40" w:line="252" w:lineRule="auto"/>
+              <w:spacing w:after="0" w:line="240" w:lineRule="auto"/>
               <w:ind w:left="250" w:hanging="250"/>
             </w:pPr>
             <w:r>
@@ -1716,7 +1716,7 @@
           </w:p>
           <w:p>
             <w:pPr>
-              <w:spacing w:after="40" w:line="252" w:lineRule="auto"/>
+              <w:spacing w:after="0" w:line="240" w:lineRule="auto"/>
               <w:ind w:left="250" w:hanging="250"/>
             </w:pPr>
             <w:r>
@@ -1749,7 +1749,7 @@
           </w:p>
           <w:p>
             <w:pPr>
-              <w:spacing w:after="0" w:line="252" w:lineRule="auto"/>
+              <w:spacing w:after="0" w:line="240" w:lineRule="auto"/>
               <w:ind w:left="250" w:hanging="250"/>
             </w:pPr>
             <w:r>
@@ -1787,7 +1787,7 @@
           </w:tcPr>
           <w:p>
             <w:pPr>
-              <w:spacing w:after="0" w:line="252" w:lineRule="auto"/>
+              <w:spacing w:after="0" w:line="240" w:lineRule="auto"/>
             </w:pPr>
             <w:r>
               <w:rPr>
@@ -1809,7 +1809,7 @@
           </w:tcPr>
           <w:p>
             <w:pPr>
-              <w:spacing w:after="20" w:line="240" w:lineRule="auto"/>
+              <w:spacing w:after="0" w:line="240" w:lineRule="auto"/>
             </w:pPr>
             <w:r>
               <w:rPr>
@@ -1823,7 +1823,7 @@
           </w:p>
           <w:p>
             <w:pPr>
-              <w:spacing w:after="30" w:line="252" w:lineRule="auto"/>
+              <w:spacing w:after="0" w:line="240" w:lineRule="auto"/>
             </w:pPr>
             <w:r>
               <w:rPr>
@@ -1855,7 +1855,7 @@
           </w:tcPr>
           <w:p>
             <w:pPr>
-              <w:spacing w:after="40" w:line="252" w:lineRule="auto"/>
+              <w:spacing w:after="0" w:line="240" w:lineRule="auto"/>
               <w:ind w:left="250" w:hanging="250"/>
             </w:pPr>
             <w:r>
@@ -1888,7 +1888,7 @@
           </w:p>
           <w:p>
             <w:pPr>
-              <w:spacing w:after="40" w:line="252" w:lineRule="auto"/>
+              <w:spacing w:after="0" w:line="240" w:lineRule="auto"/>
               <w:ind w:left="250" w:hanging="250"/>
             </w:pPr>
             <w:r>
@@ -1921,7 +1921,7 @@
           </w:p>
           <w:p>
             <w:pPr>
-              <w:spacing w:after="40" w:line="252" w:lineRule="auto"/>
+              <w:spacing w:after="0" w:line="240" w:lineRule="auto"/>
               <w:ind w:left="250" w:hanging="250"/>
             </w:pPr>
             <w:r>
@@ -1954,7 +1954,7 @@
           </w:p>
           <w:p>
             <w:pPr>
-              <w:spacing w:after="0" w:line="252" w:lineRule="auto"/>
+              <w:spacing w:after="0" w:line="240" w:lineRule="auto"/>
               <w:ind w:left="250" w:hanging="250"/>
             </w:pPr>
             <w:r>
@@ -1992,7 +1992,7 @@
           </w:tcPr>
           <w:p>
             <w:pPr>
-              <w:spacing w:after="0" w:line="252" w:lineRule="auto"/>
+              <w:spacing w:after="0" w:line="240" w:lineRule="auto"/>
             </w:pPr>
             <w:r>
               <w:rPr>
@@ -2014,7 +2014,7 @@
           </w:tcPr>
           <w:p>
             <w:pPr>
-              <w:spacing w:after="20" w:line="240" w:lineRule="auto"/>
+              <w:spacing w:after="0" w:line="240" w:lineRule="auto"/>
             </w:pPr>
             <w:r>
               <w:rPr>
@@ -2028,7 +2028,7 @@
           </w:p>
           <w:p>
             <w:pPr>
-              <w:spacing w:after="30" w:line="252" w:lineRule="auto"/>
+              <w:spacing w:after="0" w:line="240" w:lineRule="auto"/>
             </w:pPr>
             <w:r>
               <w:rPr>
@@ -2060,7 +2060,7 @@
           </w:tcPr>
           <w:p>
             <w:pPr>
-              <w:spacing w:after="40" w:line="252" w:lineRule="auto"/>
+              <w:spacing w:after="0" w:line="240" w:lineRule="auto"/>
               <w:ind w:left="250" w:hanging="250"/>
             </w:pPr>
             <w:r>
@@ -2093,7 +2093,7 @@
           </w:p>
           <w:p>
             <w:pPr>
-              <w:spacing w:after="40" w:line="252" w:lineRule="auto"/>
+              <w:spacing w:after="0" w:line="240" w:lineRule="auto"/>
               <w:ind w:left="250" w:hanging="250"/>
             </w:pPr>
             <w:r>
@@ -2126,7 +2126,7 @@
           </w:p>
           <w:p>
             <w:pPr>
-              <w:spacing w:after="40" w:line="252" w:lineRule="auto"/>
+              <w:spacing w:after="0" w:line="240" w:lineRule="auto"/>
               <w:ind w:left="250" w:hanging="250"/>
             </w:pPr>
             <w:r>
@@ -2159,7 +2159,7 @@
           </w:p>
           <w:p>
             <w:pPr>
-              <w:spacing w:after="0" w:line="252" w:lineRule="auto"/>
+              <w:spacing w:after="0" w:line="240" w:lineRule="auto"/>
               <w:ind w:left="250" w:hanging="250"/>
             </w:pPr>
             <w:r>
@@ -2197,7 +2197,7 @@
           </w:tcPr>
           <w:p>
             <w:pPr>
-              <w:spacing w:after="0" w:line="252" w:lineRule="auto"/>
+              <w:spacing w:after="0" w:line="240" w:lineRule="auto"/>
             </w:pPr>
             <w:r>
               <w:rPr>
@@ -2219,7 +2219,7 @@
           </w:tcPr>
           <w:p>
             <w:pPr>
-              <w:spacing w:after="20" w:line="240" w:lineRule="auto"/>
+              <w:spacing w:after="0" w:line="240" w:lineRule="auto"/>
             </w:pPr>
             <w:r>
               <w:rPr>
@@ -2234,7 +2234,7 @@
           </w:p>
           <w:p>
             <w:pPr>
-              <w:spacing w:after="30" w:line="252" w:lineRule="auto"/>
+              <w:spacing w:after="0" w:line="240" w:lineRule="auto"/>
             </w:pPr>
             <w:r>
               <w:rPr>
@@ -2266,7 +2266,7 @@
           </w:tcPr>
           <w:p>
             <w:pPr>
-              <w:spacing w:after="40" w:line="252" w:lineRule="auto"/>
+              <w:spacing w:after="0" w:line="240" w:lineRule="auto"/>
               <w:ind w:left="250" w:hanging="250"/>
             </w:pPr>
             <w:r>
@@ -2299,7 +2299,7 @@
           </w:p>
           <w:p>
             <w:pPr>
-              <w:spacing w:after="40" w:line="252" w:lineRule="auto"/>
+              <w:spacing w:after="0" w:line="240" w:lineRule="auto"/>
               <w:ind w:left="250" w:hanging="250"/>
             </w:pPr>
             <w:r>
@@ -2332,7 +2332,7 @@
           </w:p>
           <w:p>
             <w:pPr>
-              <w:spacing w:after="40" w:line="252" w:lineRule="auto"/>
+              <w:spacing w:after="0" w:line="240" w:lineRule="auto"/>
               <w:ind w:left="250" w:hanging="250"/>
             </w:pPr>
             <w:r>
@@ -2365,7 +2365,7 @@
           </w:p>
           <w:p>
             <w:pPr>
-              <w:spacing w:after="0" w:line="252" w:lineRule="auto"/>
+              <w:spacing w:after="0" w:line="240" w:lineRule="auto"/>
               <w:ind w:left="250" w:hanging="250"/>
             </w:pPr>
             <w:r>
@@ -2403,7 +2403,7 @@
           </w:tcPr>
           <w:p>
             <w:pPr>
-              <w:spacing w:after="0" w:line="252" w:lineRule="auto"/>
+              <w:spacing w:after="0" w:line="240" w:lineRule="auto"/>
             </w:pPr>
             <w:r>
               <w:rPr>
@@ -2425,7 +2425,7 @@
           </w:tcPr>
           <w:p>
             <w:pPr>
-              <w:spacing w:after="20" w:line="240" w:lineRule="auto"/>
+              <w:spacing w:after="0" w:line="240" w:lineRule="auto"/>
             </w:pPr>
             <w:r>
               <w:rPr>
@@ -2439,7 +2439,7 @@
           </w:p>
           <w:p>
             <w:pPr>
-              <w:spacing w:after="30" w:line="252" w:lineRule="auto"/>
+              <w:spacing w:after="0" w:line="240" w:lineRule="auto"/>
             </w:pPr>
             <w:r>
               <w:rPr>
@@ -2471,7 +2471,7 @@
           </w:tcPr>
           <w:p>
             <w:pPr>
-              <w:spacing w:after="40" w:line="252" w:lineRule="auto"/>
+              <w:spacing w:after="0" w:line="240" w:lineRule="auto"/>
               <w:ind w:left="250" w:hanging="250"/>
             </w:pPr>
             <w:r>
@@ -2504,7 +2504,7 @@
           </w:p>
           <w:p>
             <w:pPr>
-              <w:spacing w:after="40" w:line="252" w:lineRule="auto"/>
+              <w:spacing w:after="0" w:line="240" w:lineRule="auto"/>
               <w:ind w:left="250" w:hanging="250"/>
             </w:pPr>
             <w:r>
@@ -2537,7 +2537,7 @@
           </w:p>
           <w:p>
             <w:pPr>
-              <w:spacing w:after="40" w:line="252" w:lineRule="auto"/>
+              <w:spacing w:after="0" w:line="240" w:lineRule="auto"/>
               <w:ind w:left="250" w:hanging="250"/>
             </w:pPr>
             <w:r>
@@ -2570,7 +2570,7 @@
           </w:p>
           <w:p>
             <w:pPr>
-              <w:spacing w:after="0" w:line="252" w:lineRule="auto"/>
+              <w:spacing w:after="0" w:line="240" w:lineRule="auto"/>
               <w:ind w:left="250" w:hanging="250"/>
             </w:pPr>
             <w:r>
@@ -2608,7 +2608,7 @@
           </w:tcPr>
           <w:p>
             <w:pPr>
-              <w:spacing w:after="0" w:line="252" w:lineRule="auto"/>
+              <w:spacing w:after="0" w:line="240" w:lineRule="auto"/>
             </w:pPr>
             <w:r>
               <w:rPr>
@@ -2630,7 +2630,7 @@
           </w:tcPr>
           <w:p>
             <w:pPr>
-              <w:spacing w:after="20" w:line="240" w:lineRule="auto"/>
+              <w:spacing w:after="0" w:line="240" w:lineRule="auto"/>
             </w:pPr>
             <w:r>
               <w:rPr>
@@ -2644,7 +2644,7 @@
           </w:p>
           <w:p>
             <w:pPr>
-              <w:spacing w:after="30" w:line="252" w:lineRule="auto"/>
+              <w:spacing w:after="0" w:line="240" w:lineRule="auto"/>
             </w:pPr>
             <w:r>
               <w:rPr>
@@ -2676,7 +2676,7 @@
           </w:tcPr>
           <w:p>
             <w:pPr>
-              <w:spacing w:after="40" w:line="252" w:lineRule="auto"/>
+              <w:spacing w:after="0" w:line="240" w:lineRule="auto"/>
               <w:ind w:left="250" w:hanging="250"/>
             </w:pPr>
             <w:r>
@@ -2709,7 +2709,7 @@
           </w:p>
           <w:p>
             <w:pPr>
-              <w:spacing w:after="40" w:line="252" w:lineRule="auto"/>
+              <w:spacing w:after="0" w:line="240" w:lineRule="auto"/>
               <w:ind w:left="250" w:hanging="250"/>
             </w:pPr>
             <w:r>
@@ -2742,7 +2742,7 @@
           </w:p>
           <w:p>
             <w:pPr>
-              <w:spacing w:after="40" w:line="252" w:lineRule="auto"/>
+              <w:spacing w:after="0" w:line="240" w:lineRule="auto"/>
               <w:ind w:left="250" w:hanging="250"/>
             </w:pPr>
             <w:r>
@@ -2775,7 +2775,7 @@
           </w:p>
           <w:p>
             <w:pPr>
-              <w:spacing w:after="0" w:line="252" w:lineRule="auto"/>
+              <w:spacing w:after="0" w:line="240" w:lineRule="auto"/>
               <w:ind w:left="250" w:hanging="250"/>
             </w:pPr>
             <w:r>
@@ -2813,7 +2813,7 @@
           </w:tcPr>
           <w:p>
             <w:pPr>
-              <w:spacing w:after="0" w:line="252" w:lineRule="auto"/>
+              <w:spacing w:after="0" w:line="240" w:lineRule="auto"/>
             </w:pPr>
             <w:r>
               <w:rPr>
@@ -2835,7 +2835,7 @@
           </w:tcPr>
           <w:p>
             <w:pPr>
-              <w:spacing w:after="20" w:line="240" w:lineRule="auto"/>
+              <w:spacing w:after="0" w:line="240" w:lineRule="auto"/>
             </w:pPr>
             <w:r>
               <w:rPr>
@@ -2849,7 +2849,7 @@
           </w:p>
           <w:p>
             <w:pPr>
-              <w:spacing w:after="30" w:line="252" w:lineRule="auto"/>
+              <w:spacing w:after="0" w:line="240" w:lineRule="auto"/>
             </w:pPr>
             <w:r>
               <w:rPr>
@@ -2881,7 +2881,7 @@
           </w:tcPr>
           <w:p>
             <w:pPr>
-              <w:spacing w:after="40" w:line="252" w:lineRule="auto"/>
+              <w:spacing w:after="0" w:line="240" w:lineRule="auto"/>
               <w:ind w:left="250" w:hanging="250"/>
             </w:pPr>
             <w:r>
@@ -2914,7 +2914,7 @@
           </w:p>
           <w:p>
             <w:pPr>
-              <w:spacing w:after="40" w:line="252" w:lineRule="auto"/>
+              <w:spacing w:after="0" w:line="240" w:lineRule="auto"/>
               <w:ind w:left="250" w:hanging="250"/>
             </w:pPr>
             <w:r>
@@ -2947,7 +2947,7 @@
           </w:p>
           <w:p>
             <w:pPr>
-              <w:spacing w:after="40" w:line="252" w:lineRule="auto"/>
+              <w:spacing w:after="0" w:line="240" w:lineRule="auto"/>
               <w:ind w:left="250" w:hanging="250"/>
             </w:pPr>
             <w:r>
@@ -2980,7 +2980,7 @@
           </w:p>
           <w:p>
             <w:pPr>
-              <w:spacing w:after="0" w:line="252" w:lineRule="auto"/>
+              <w:spacing w:after="0" w:line="240" w:lineRule="auto"/>
               <w:ind w:left="250" w:hanging="250"/>
             </w:pPr>
             <w:r>
@@ -3018,7 +3018,7 @@
           </w:tcPr>
           <w:p>
             <w:pPr>
-              <w:spacing w:after="0" w:line="252" w:lineRule="auto"/>
+              <w:spacing w:after="0" w:line="240" w:lineRule="auto"/>
             </w:pPr>
             <w:r>
               <w:rPr>
@@ -3040,7 +3040,7 @@
           </w:tcPr>
           <w:p>
             <w:pPr>
-              <w:spacing w:after="20" w:line="240" w:lineRule="auto"/>
+              <w:spacing w:after="0" w:line="240" w:lineRule="auto"/>
             </w:pPr>
             <w:r>
               <w:rPr>
@@ -3054,7 +3054,7 @@
           </w:p>
           <w:p>
             <w:pPr>
-              <w:spacing w:after="30" w:line="252" w:lineRule="auto"/>
+              <w:spacing w:after="0" w:line="240" w:lineRule="auto"/>
             </w:pPr>
             <w:r>
               <w:rPr>
@@ -3086,7 +3086,7 @@
           </w:tcPr>
           <w:p>
             <w:pPr>
-              <w:spacing w:after="40" w:line="252" w:lineRule="auto"/>
+              <w:spacing w:after="0" w:line="240" w:lineRule="auto"/>
               <w:ind w:left="250" w:hanging="250"/>
             </w:pPr>
             <w:r>
@@ -3119,7 +3119,7 @@
           </w:p>
           <w:p>
             <w:pPr>
-              <w:spacing w:after="40" w:line="252" w:lineRule="auto"/>
+              <w:spacing w:after="0" w:line="240" w:lineRule="auto"/>
               <w:ind w:left="250" w:hanging="250"/>
             </w:pPr>
             <w:r>
@@ -3152,7 +3152,7 @@
           </w:p>
           <w:p>
             <w:pPr>
-              <w:spacing w:after="40" w:line="252" w:lineRule="auto"/>
+              <w:spacing w:after="0" w:line="240" w:lineRule="auto"/>
               <w:ind w:left="250" w:hanging="250"/>
             </w:pPr>
             <w:r>
@@ -3185,7 +3185,7 @@
           </w:p>
           <w:p>
             <w:pPr>
-              <w:spacing w:after="0" w:line="252" w:lineRule="auto"/>
+              <w:spacing w:after="0" w:line="240" w:lineRule="auto"/>
               <w:ind w:left="250" w:hanging="250"/>
             </w:pPr>
             <w:r>
@@ -3223,7 +3223,7 @@
           </w:tcPr>
           <w:p>
             <w:pPr>
-              <w:spacing w:after="0" w:line="252" w:lineRule="auto"/>
+              <w:spacing w:after="0" w:line="240" w:lineRule="auto"/>
             </w:pPr>
             <w:r>
               <w:rPr>
@@ -3240,7 +3240,7 @@
       <w:pPr>
         <w:keepNext/>
         <w:pageBreakBefore/>
-        <w:spacing w:after="16"/>
+        <w:spacing w:after="0"/>
       </w:pPr>
       <w:r>
         <w:rPr>
@@ -3258,7 +3258,7 @@
     <w:p>
       <w:pPr>
         <w:keepNext/>
-        <w:spacing w:after="60" w:line="240" w:lineRule="auto"/>
+        <w:spacing w:after="0" w:line="240" w:lineRule="auto"/>
       </w:pPr>
       <w:r>
         <w:rPr>
@@ -3272,7 +3272,7 @@
     <w:p>
       <w:pPr>
         <w:keepNext/>
-        <w:spacing w:after="110" w:line="264" w:lineRule="auto"/>
+        <w:spacing w:after="0" w:line="240" w:lineRule="auto"/>
       </w:pPr>
       <w:r>
         <w:rPr>
@@ -3288,7 +3288,7 @@
         <w:pBdr>
           <w:bottom w:val="single" w:sz="4" w:space="5" w:color="C9CDD2"/>
         </w:pBdr>
-        <w:spacing w:after="150" w:line="264" w:lineRule="auto"/>
+        <w:spacing w:after="0" w:line="240" w:lineRule="auto"/>
       </w:pPr>
     </w:p>
     <w:tbl>
@@ -3398,7 +3398,7 @@
           </w:tcPr>
           <w:p>
             <w:pPr>
-              <w:spacing w:after="20" w:line="240" w:lineRule="auto"/>
+              <w:spacing w:after="0" w:line="240" w:lineRule="auto"/>
             </w:pPr>
             <w:r>
               <w:rPr>
@@ -3412,7 +3412,7 @@
           </w:p>
           <w:p>
             <w:pPr>
-              <w:spacing w:after="30" w:line="252" w:lineRule="auto"/>
+              <w:spacing w:after="0" w:line="240" w:lineRule="auto"/>
             </w:pPr>
             <w:r>
               <w:rPr>
@@ -3444,7 +3444,7 @@
           </w:tcPr>
           <w:p>
             <w:pPr>
-              <w:spacing w:after="40" w:line="252" w:lineRule="auto"/>
+              <w:spacing w:after="0" w:line="240" w:lineRule="auto"/>
               <w:ind w:left="250" w:hanging="250"/>
             </w:pPr>
             <w:r>
@@ -3477,7 +3477,7 @@
           </w:p>
           <w:p>
             <w:pPr>
-              <w:spacing w:after="40" w:line="252" w:lineRule="auto"/>
+              <w:spacing w:after="0" w:line="240" w:lineRule="auto"/>
               <w:ind w:left="250" w:hanging="250"/>
             </w:pPr>
             <w:r>
@@ -3510,7 +3510,7 @@
           </w:p>
           <w:p>
             <w:pPr>
-              <w:spacing w:after="40" w:line="252" w:lineRule="auto"/>
+              <w:spacing w:after="0" w:line="240" w:lineRule="auto"/>
               <w:ind w:left="250" w:hanging="250"/>
             </w:pPr>
             <w:r>
@@ -3543,7 +3543,7 @@
           </w:p>
           <w:p>
             <w:pPr>
-              <w:spacing w:after="0" w:line="252" w:lineRule="auto"/>
+              <w:spacing w:after="0" w:line="240" w:lineRule="auto"/>
               <w:ind w:left="250" w:hanging="250"/>
             </w:pPr>
             <w:r>
@@ -3581,7 +3581,7 @@
           </w:tcPr>
           <w:p>
             <w:pPr>
-              <w:spacing w:after="0" w:line="252" w:lineRule="auto"/>
+              <w:spacing w:after="0" w:line="240" w:lineRule="auto"/>
             </w:pPr>
             <w:r>
               <w:rPr>
@@ -3604,7 +3604,7 @@
           </w:tcPr>
           <w:p>
             <w:pPr>
-              <w:spacing w:after="20" w:line="240" w:lineRule="auto"/>
+              <w:spacing w:after="0" w:line="240" w:lineRule="auto"/>
             </w:pPr>
             <w:r>
               <w:rPr>
@@ -3618,7 +3618,7 @@
           </w:p>
           <w:p>
             <w:pPr>
-              <w:spacing w:after="30" w:line="252" w:lineRule="auto"/>
+              <w:spacing w:after="0" w:line="240" w:lineRule="auto"/>
             </w:pPr>
             <w:r>
               <w:rPr>
@@ -3650,7 +3650,7 @@
           </w:tcPr>
           <w:p>
             <w:pPr>
-              <w:spacing w:after="40" w:line="252" w:lineRule="auto"/>
+              <w:spacing w:after="0" w:line="240" w:lineRule="auto"/>
               <w:ind w:left="250" w:hanging="250"/>
             </w:pPr>
             <w:r>
@@ -3683,7 +3683,7 @@
           </w:p>
           <w:p>
             <w:pPr>
-              <w:spacing w:after="40" w:line="252" w:lineRule="auto"/>
+              <w:spacing w:after="0" w:line="240" w:lineRule="auto"/>
               <w:ind w:left="250" w:hanging="250"/>
             </w:pPr>
             <w:r>
@@ -3716,7 +3716,7 @@
           </w:p>
           <w:p>
             <w:pPr>
-              <w:spacing w:after="40" w:line="252" w:lineRule="auto"/>
+              <w:spacing w:after="0" w:line="240" w:lineRule="auto"/>
               <w:ind w:left="250" w:hanging="250"/>
             </w:pPr>
             <w:r>
@@ -3749,7 +3749,7 @@
           </w:p>
           <w:p>
             <w:pPr>
-              <w:spacing w:after="0" w:line="252" w:lineRule="auto"/>
+              <w:spacing w:after="0" w:line="240" w:lineRule="auto"/>
               <w:ind w:left="250" w:hanging="250"/>
             </w:pPr>
             <w:r>
@@ -3787,7 +3787,7 @@
           </w:tcPr>
           <w:p>
             <w:pPr>
-              <w:spacing w:after="0" w:line="252" w:lineRule="auto"/>
+              <w:spacing w:after="0" w:line="240" w:lineRule="auto"/>
             </w:pPr>
             <w:r>
               <w:rPr>
@@ -3809,7 +3809,7 @@
           </w:tcPr>
           <w:p>
             <w:pPr>
-              <w:spacing w:after="20" w:line="240" w:lineRule="auto"/>
+              <w:spacing w:after="0" w:line="240" w:lineRule="auto"/>
             </w:pPr>
             <w:r>
               <w:rPr>
@@ -3823,7 +3823,7 @@
           </w:p>
           <w:p>
             <w:pPr>
-              <w:spacing w:after="30" w:line="252" w:lineRule="auto"/>
+              <w:spacing w:after="0" w:line="240" w:lineRule="auto"/>
             </w:pPr>
             <w:r>
               <w:rPr>
@@ -3855,7 +3855,7 @@
           </w:tcPr>
           <w:p>
             <w:pPr>
-              <w:spacing w:after="40" w:line="252" w:lineRule="auto"/>
+              <w:spacing w:after="0" w:line="240" w:lineRule="auto"/>
               <w:ind w:left="250" w:hanging="250"/>
             </w:pPr>
             <w:r>
@@ -3888,7 +3888,7 @@
           </w:p>
           <w:p>
             <w:pPr>
-              <w:spacing w:after="40" w:line="252" w:lineRule="auto"/>
+              <w:spacing w:after="0" w:line="240" w:lineRule="auto"/>
               <w:ind w:left="250" w:hanging="250"/>
             </w:pPr>
             <w:r>
@@ -3921,7 +3921,7 @@
           </w:p>
           <w:p>
             <w:pPr>
-              <w:spacing w:after="40" w:line="252" w:lineRule="auto"/>
+              <w:spacing w:after="0" w:line="240" w:lineRule="auto"/>
               <w:ind w:left="250" w:hanging="250"/>
             </w:pPr>
             <w:r>
@@ -3954,7 +3954,7 @@
           </w:p>
           <w:p>
             <w:pPr>
-              <w:spacing w:after="0" w:line="252" w:lineRule="auto"/>
+              <w:spacing w:after="0" w:line="240" w:lineRule="auto"/>
               <w:ind w:left="250" w:hanging="250"/>
             </w:pPr>
             <w:r>
@@ -3992,7 +3992,7 @@
           </w:tcPr>
           <w:p>
             <w:pPr>
-              <w:spacing w:after="0" w:line="252" w:lineRule="auto"/>
+              <w:spacing w:after="0" w:line="240" w:lineRule="auto"/>
             </w:pPr>
             <w:r>
               <w:rPr>
@@ -4014,7 +4014,7 @@
           </w:tcPr>
           <w:p>
             <w:pPr>
-              <w:spacing w:after="20" w:line="240" w:lineRule="auto"/>
+              <w:spacing w:after="0" w:line="240" w:lineRule="auto"/>
             </w:pPr>
             <w:r>
               <w:rPr>
@@ -4028,7 +4028,7 @@
           </w:p>
           <w:p>
             <w:pPr>
-              <w:spacing w:after="30" w:line="252" w:lineRule="auto"/>
+              <w:spacing w:after="0" w:line="240" w:lineRule="auto"/>
             </w:pPr>
             <w:r>
               <w:rPr>
@@ -4060,7 +4060,7 @@
           </w:tcPr>
           <w:p>
             <w:pPr>
-              <w:spacing w:after="40" w:line="252" w:lineRule="auto"/>
+              <w:spacing w:after="0" w:line="240" w:lineRule="auto"/>
               <w:ind w:left="250" w:hanging="250"/>
             </w:pPr>
             <w:r>
@@ -4093,7 +4093,7 @@
           </w:p>
           <w:p>
             <w:pPr>
-              <w:spacing w:after="40" w:line="252" w:lineRule="auto"/>
+              <w:spacing w:after="0" w:line="240" w:lineRule="auto"/>
               <w:ind w:left="250" w:hanging="250"/>
             </w:pPr>
             <w:r>
@@ -4126,7 +4126,7 @@
           </w:p>
           <w:p>
             <w:pPr>
-              <w:spacing w:after="40" w:line="252" w:lineRule="auto"/>
+              <w:spacing w:after="0" w:line="240" w:lineRule="auto"/>
               <w:ind w:left="250" w:hanging="250"/>
             </w:pPr>
             <w:r>
@@ -4159,7 +4159,7 @@
           </w:p>
           <w:p>
             <w:pPr>
-              <w:spacing w:after="0" w:line="252" w:lineRule="auto"/>
+              <w:spacing w:after="0" w:line="240" w:lineRule="auto"/>
               <w:ind w:left="250" w:hanging="250"/>
             </w:pPr>
             <w:r>
@@ -4197,7 +4197,7 @@
           </w:tcPr>
           <w:p>
             <w:pPr>
-              <w:spacing w:after="0" w:line="252" w:lineRule="auto"/>
+              <w:spacing w:after="0" w:line="240" w:lineRule="auto"/>
             </w:pPr>
             <w:r>
               <w:rPr>
@@ -4219,7 +4219,7 @@
           </w:tcPr>
           <w:p>
             <w:pPr>
-              <w:spacing w:after="20" w:line="240" w:lineRule="auto"/>
+              <w:spacing w:after="0" w:line="240" w:lineRule="auto"/>
             </w:pPr>
             <w:r>
               <w:rPr>
@@ -4233,7 +4233,7 @@
           </w:p>
           <w:p>
             <w:pPr>
-              <w:spacing w:after="30" w:line="252" w:lineRule="auto"/>
+              <w:spacing w:after="0" w:line="240" w:lineRule="auto"/>
             </w:pPr>
             <w:r>
               <w:rPr>
@@ -4265,7 +4265,7 @@
           </w:tcPr>
           <w:p>
             <w:pPr>
-              <w:spacing w:after="40" w:line="252" w:lineRule="auto"/>
+              <w:spacing w:after="0" w:line="240" w:lineRule="auto"/>
               <w:ind w:left="250" w:hanging="250"/>
             </w:pPr>
             <w:r>
@@ -4298,7 +4298,7 @@
           </w:p>
           <w:p>
             <w:pPr>
-              <w:spacing w:after="40" w:line="252" w:lineRule="auto"/>
+              <w:spacing w:after="0" w:line="240" w:lineRule="auto"/>
               <w:ind w:left="250" w:hanging="250"/>
             </w:pPr>
             <w:r>
@@ -4331,7 +4331,7 @@
           </w:p>
           <w:p>
             <w:pPr>
-              <w:spacing w:after="40" w:line="252" w:lineRule="auto"/>
+              <w:spacing w:after="0" w:line="240" w:lineRule="auto"/>
               <w:ind w:left="250" w:hanging="250"/>
             </w:pPr>
             <w:r>
@@ -4364,7 +4364,7 @@
           </w:p>
           <w:p>
             <w:pPr>
-              <w:spacing w:after="0" w:line="252" w:lineRule="auto"/>
+              <w:spacing w:after="0" w:line="240" w:lineRule="auto"/>
               <w:ind w:left="250" w:hanging="250"/>
             </w:pPr>
             <w:r>
@@ -4402,7 +4402,7 @@
           </w:tcPr>
           <w:p>
             <w:pPr>
-              <w:spacing w:after="0" w:line="252" w:lineRule="auto"/>
+              <w:spacing w:after="0" w:line="240" w:lineRule="auto"/>
             </w:pPr>
             <w:r>
               <w:rPr>
@@ -4424,7 +4424,7 @@
           </w:tcPr>
           <w:p>
             <w:pPr>
-              <w:spacing w:after="20" w:line="240" w:lineRule="auto"/>
+              <w:spacing w:after="0" w:line="240" w:lineRule="auto"/>
             </w:pPr>
             <w:r>
               <w:rPr>
@@ -4439,7 +4439,7 @@
           </w:p>
           <w:p>
             <w:pPr>
-              <w:spacing w:after="30" w:line="252" w:lineRule="auto"/>
+              <w:spacing w:after="0" w:line="240" w:lineRule="auto"/>
             </w:pPr>
             <w:r>
               <w:rPr>
@@ -4471,7 +4471,7 @@
           </w:tcPr>
           <w:p>
             <w:pPr>
-              <w:spacing w:after="40" w:line="252" w:lineRule="auto"/>
+              <w:spacing w:after="0" w:line="240" w:lineRule="auto"/>
               <w:ind w:left="250" w:hanging="250"/>
             </w:pPr>
             <w:r>
@@ -4504,7 +4504,7 @@
           </w:p>
           <w:p>
             <w:pPr>
-              <w:spacing w:after="40" w:line="252" w:lineRule="auto"/>
+              <w:spacing w:after="0" w:line="240" w:lineRule="auto"/>
               <w:ind w:left="250" w:hanging="250"/>
             </w:pPr>
             <w:r>
@@ -4537,7 +4537,7 @@
           </w:p>
           <w:p>
             <w:pPr>
-              <w:spacing w:after="40" w:line="252" w:lineRule="auto"/>
+              <w:spacing w:after="0" w:line="240" w:lineRule="auto"/>
               <w:ind w:left="250" w:hanging="250"/>
             </w:pPr>
             <w:r>
@@ -4570,7 +4570,7 @@
           </w:p>
           <w:p>
             <w:pPr>
-              <w:spacing w:after="0" w:line="252" w:lineRule="auto"/>
+              <w:spacing w:after="0" w:line="240" w:lineRule="auto"/>
               <w:ind w:left="250" w:hanging="250"/>
             </w:pPr>
             <w:r>
@@ -4608,7 +4608,7 @@
           </w:tcPr>
           <w:p>
             <w:pPr>
-              <w:spacing w:after="0" w:line="252" w:lineRule="auto"/>
+              <w:spacing w:after="0" w:line="240" w:lineRule="auto"/>
             </w:pPr>
             <w:r>
               <w:rPr>
@@ -4630,7 +4630,7 @@
           </w:tcPr>
           <w:p>
             <w:pPr>
-              <w:spacing w:after="20" w:line="240" w:lineRule="auto"/>
+              <w:spacing w:after="0" w:line="240" w:lineRule="auto"/>
             </w:pPr>
             <w:r>
               <w:rPr>
@@ -4644,7 +4644,7 @@
           </w:p>
           <w:p>
             <w:pPr>
-              <w:spacing w:after="30" w:line="252" w:lineRule="auto"/>
+              <w:spacing w:after="0" w:line="240" w:lineRule="auto"/>
             </w:pPr>
             <w:r>
               <w:rPr>
@@ -4676,7 +4676,7 @@
           </w:tcPr>
           <w:p>
             <w:pPr>
-              <w:spacing w:after="40" w:line="252" w:lineRule="auto"/>
+              <w:spacing w:after="0" w:line="240" w:lineRule="auto"/>
               <w:ind w:left="250" w:hanging="250"/>
             </w:pPr>
             <w:r>
@@ -4709,7 +4709,7 @@
           </w:p>
           <w:p>
             <w:pPr>
-              <w:spacing w:after="40" w:line="252" w:lineRule="auto"/>
+              <w:spacing w:after="0" w:line="240" w:lineRule="auto"/>
               <w:ind w:left="250" w:hanging="250"/>
             </w:pPr>
             <w:r>
@@ -4742,7 +4742,7 @@
           </w:p>
           <w:p>
             <w:pPr>
-              <w:spacing w:after="40" w:line="252" w:lineRule="auto"/>
+              <w:spacing w:after="0" w:line="240" w:lineRule="auto"/>
               <w:ind w:left="250" w:hanging="250"/>
             </w:pPr>
             <w:r>
@@ -4775,7 +4775,7 @@
           </w:p>
           <w:p>
             <w:pPr>
-              <w:spacing w:after="0" w:line="252" w:lineRule="auto"/>
+              <w:spacing w:after="0" w:line="240" w:lineRule="auto"/>
               <w:ind w:left="250" w:hanging="250"/>
             </w:pPr>
             <w:r>
@@ -4813,7 +4813,7 @@
           </w:tcPr>
           <w:p>
             <w:pPr>
-              <w:spacing w:after="0" w:line="252" w:lineRule="auto"/>
+              <w:spacing w:after="0" w:line="240" w:lineRule="auto"/>
             </w:pPr>
             <w:r>
               <w:rPr>
@@ -4830,7 +4830,7 @@
       <w:pPr>
         <w:keepNext/>
         <w:pageBreakBefore/>
-        <w:spacing w:after="16"/>
+        <w:spacing w:after="0"/>
       </w:pPr>
       <w:r>
         <w:rPr>
@@ -4848,7 +4848,7 @@
     <w:p>
       <w:pPr>
         <w:keepNext/>
-        <w:spacing w:after="60" w:line="240" w:lineRule="auto"/>
+        <w:spacing w:after="0" w:line="240" w:lineRule="auto"/>
       </w:pPr>
       <w:r>
         <w:rPr>
@@ -4862,7 +4862,7 @@
     <w:p>
       <w:pPr>
         <w:keepNext/>
-        <w:spacing w:after="110" w:line="264" w:lineRule="auto"/>
+        <w:spacing w:after="0" w:line="240" w:lineRule="auto"/>
       </w:pPr>
       <w:r>
         <w:rPr>
@@ -4878,7 +4878,7 @@
         <w:pBdr>
           <w:bottom w:val="single" w:sz="4" w:space="5" w:color="C9CDD2"/>
         </w:pBdr>
-        <w:spacing w:after="150" w:line="264" w:lineRule="auto"/>
+        <w:spacing w:after="0" w:line="240" w:lineRule="auto"/>
       </w:pPr>
     </w:p>
     <w:tbl>
@@ -4988,7 +4988,7 @@
           </w:tcPr>
           <w:p>
             <w:pPr>
-              <w:spacing w:after="20" w:line="240" w:lineRule="auto"/>
+              <w:spacing w:after="0" w:line="240" w:lineRule="auto"/>
             </w:pPr>
             <w:r>
               <w:rPr>
@@ -5002,7 +5002,7 @@
           </w:p>
           <w:p>
             <w:pPr>
-              <w:spacing w:after="30" w:line="252" w:lineRule="auto"/>
+              <w:spacing w:after="0" w:line="240" w:lineRule="auto"/>
             </w:pPr>
             <w:r>
               <w:rPr>
@@ -5034,7 +5034,7 @@
           </w:tcPr>
           <w:p>
             <w:pPr>
-              <w:spacing w:after="40" w:line="252" w:lineRule="auto"/>
+              <w:spacing w:after="0" w:line="240" w:lineRule="auto"/>
               <w:ind w:left="250" w:hanging="250"/>
             </w:pPr>
             <w:r>
@@ -5067,7 +5067,7 @@
           </w:p>
           <w:p>
             <w:pPr>
-              <w:spacing w:after="40" w:line="252" w:lineRule="auto"/>
+              <w:spacing w:after="0" w:line="240" w:lineRule="auto"/>
               <w:ind w:left="250" w:hanging="250"/>
             </w:pPr>
             <w:r>
@@ -5100,7 +5100,7 @@
           </w:p>
           <w:p>
             <w:pPr>
-              <w:spacing w:after="40" w:line="252" w:lineRule="auto"/>
+              <w:spacing w:after="0" w:line="240" w:lineRule="auto"/>
               <w:ind w:left="250" w:hanging="250"/>
             </w:pPr>
             <w:r>
@@ -5133,7 +5133,7 @@
           </w:p>
           <w:p>
             <w:pPr>
-              <w:spacing w:after="0" w:line="252" w:lineRule="auto"/>
+              <w:spacing w:after="0" w:line="240" w:lineRule="auto"/>
               <w:ind w:left="250" w:hanging="250"/>
             </w:pPr>
             <w:r>
@@ -5171,7 +5171,7 @@
           </w:tcPr>
           <w:p>
             <w:pPr>
-              <w:spacing w:after="0" w:line="252" w:lineRule="auto"/>
+              <w:spacing w:after="0" w:line="240" w:lineRule="auto"/>
             </w:pPr>
             <w:r>
               <w:rPr>
@@ -5193,7 +5193,7 @@
           </w:tcPr>
           <w:p>
             <w:pPr>
-              <w:spacing w:after="20" w:line="240" w:lineRule="auto"/>
+              <w:spacing w:after="0" w:line="240" w:lineRule="auto"/>
             </w:pPr>
             <w:r>
               <w:rPr>
@@ -5207,7 +5207,7 @@
           </w:p>
           <w:p>
             <w:pPr>
-              <w:spacing w:after="30" w:line="252" w:lineRule="auto"/>
+              <w:spacing w:after="0" w:line="240" w:lineRule="auto"/>
             </w:pPr>
             <w:r>
               <w:rPr>
@@ -5239,7 +5239,7 @@
           </w:tcPr>
           <w:p>
             <w:pPr>
-              <w:spacing w:after="40" w:line="252" w:lineRule="auto"/>
+              <w:spacing w:after="0" w:line="240" w:lineRule="auto"/>
               <w:ind w:left="250" w:hanging="250"/>
             </w:pPr>
             <w:r>
@@ -5272,7 +5272,7 @@
           </w:p>
           <w:p>
             <w:pPr>
-              <w:spacing w:after="40" w:line="252" w:lineRule="auto"/>
+              <w:spacing w:after="0" w:line="240" w:lineRule="auto"/>
               <w:ind w:left="250" w:hanging="250"/>
             </w:pPr>
             <w:r>
@@ -5305,7 +5305,7 @@
           </w:p>
           <w:p>
             <w:pPr>
-              <w:spacing w:after="40" w:line="252" w:lineRule="auto"/>
+              <w:spacing w:after="0" w:line="240" w:lineRule="auto"/>
               <w:ind w:left="250" w:hanging="250"/>
             </w:pPr>
             <w:r>
@@ -5338,7 +5338,7 @@
           </w:p>
           <w:p>
             <w:pPr>
-              <w:spacing w:after="0" w:line="252" w:lineRule="auto"/>
+              <w:spacing w:after="0" w:line="240" w:lineRule="auto"/>
               <w:ind w:left="250" w:hanging="250"/>
             </w:pPr>
             <w:r>
@@ -5376,7 +5376,7 @@
           </w:tcPr>
           <w:p>
             <w:pPr>
-              <w:spacing w:after="0" w:line="252" w:lineRule="auto"/>
+              <w:spacing w:after="0" w:line="240" w:lineRule="auto"/>
             </w:pPr>
             <w:r>
               <w:rPr>
@@ -5398,7 +5398,7 @@
           </w:tcPr>
           <w:p>
             <w:pPr>
-              <w:spacing w:after="20" w:line="240" w:lineRule="auto"/>
+              <w:spacing w:after="0" w:line="240" w:lineRule="auto"/>
             </w:pPr>
             <w:r>
               <w:rPr>
@@ -5412,7 +5412,7 @@
           </w:p>
           <w:p>
             <w:pPr>
-              <w:spacing w:after="30" w:line="252" w:lineRule="auto"/>
+              <w:spacing w:after="0" w:line="240" w:lineRule="auto"/>
             </w:pPr>
             <w:r>
               <w:rPr>
@@ -5444,7 +5444,7 @@
           </w:tcPr>
           <w:p>
             <w:pPr>
-              <w:spacing w:after="40" w:line="252" w:lineRule="auto"/>
+              <w:spacing w:after="0" w:line="240" w:lineRule="auto"/>
               <w:ind w:left="250" w:hanging="250"/>
             </w:pPr>
             <w:r>
@@ -5477,7 +5477,7 @@
           </w:p>
           <w:p>
             <w:pPr>
-              <w:spacing w:after="40" w:line="252" w:lineRule="auto"/>
+              <w:spacing w:after="0" w:line="240" w:lineRule="auto"/>
               <w:ind w:left="250" w:hanging="250"/>
             </w:pPr>
             <w:r>
@@ -5510,7 +5510,7 @@
           </w:p>
           <w:p>
             <w:pPr>
-              <w:spacing w:after="40" w:line="252" w:lineRule="auto"/>
+              <w:spacing w:after="0" w:line="240" w:lineRule="auto"/>
               <w:ind w:left="250" w:hanging="250"/>
             </w:pPr>
             <w:r>
@@ -5543,7 +5543,7 @@
           </w:p>
           <w:p>
             <w:pPr>
-              <w:spacing w:after="0" w:line="252" w:lineRule="auto"/>
+              <w:spacing w:after="0" w:line="240" w:lineRule="auto"/>
               <w:ind w:left="250" w:hanging="250"/>
             </w:pPr>
             <w:r>
@@ -5581,7 +5581,7 @@
           </w:tcPr>
           <w:p>
             <w:pPr>
-              <w:spacing w:after="0" w:line="252" w:lineRule="auto"/>
+              <w:spacing w:after="0" w:line="240" w:lineRule="auto"/>
             </w:pPr>
             <w:r>
               <w:rPr>
@@ -5603,7 +5603,7 @@
           </w:tcPr>
           <w:p>
             <w:pPr>
-              <w:spacing w:after="20" w:line="240" w:lineRule="auto"/>
+              <w:spacing w:after="0" w:line="240" w:lineRule="auto"/>
             </w:pPr>
             <w:r>
               <w:rPr>
@@ -5617,7 +5617,7 @@
           </w:p>
           <w:p>
             <w:pPr>
-              <w:spacing w:after="30" w:line="252" w:lineRule="auto"/>
+              <w:spacing w:after="0" w:line="240" w:lineRule="auto"/>
             </w:pPr>
             <w:r>
               <w:rPr>
@@ -5649,7 +5649,7 @@
           </w:tcPr>
           <w:p>
             <w:pPr>
-              <w:spacing w:after="40" w:line="252" w:lineRule="auto"/>
+              <w:spacing w:after="0" w:line="240" w:lineRule="auto"/>
               <w:ind w:left="250" w:hanging="250"/>
             </w:pPr>
             <w:r>
@@ -5682,7 +5682,7 @@
           </w:p>
           <w:p>
             <w:pPr>
-              <w:spacing w:after="40" w:line="252" w:lineRule="auto"/>
+              <w:spacing w:after="0" w:line="240" w:lineRule="auto"/>
               <w:ind w:left="250" w:hanging="250"/>
             </w:pPr>
             <w:r>
@@ -5715,7 +5715,7 @@
           </w:p>
           <w:p>
             <w:pPr>
-              <w:spacing w:after="40" w:line="252" w:lineRule="auto"/>
+              <w:spacing w:after="0" w:line="240" w:lineRule="auto"/>
               <w:ind w:left="250" w:hanging="250"/>
             </w:pPr>
             <w:r>
@@ -5748,7 +5748,7 @@
           </w:p>
           <w:p>
             <w:pPr>
-              <w:spacing w:after="0" w:line="252" w:lineRule="auto"/>
+              <w:spacing w:after="0" w:line="240" w:lineRule="auto"/>
               <w:ind w:left="250" w:hanging="250"/>
             </w:pPr>
             <w:r>
@@ -5786,7 +5786,7 @@
           </w:tcPr>
           <w:p>
             <w:pPr>
-              <w:spacing w:after="0" w:line="252" w:lineRule="auto"/>
+              <w:spacing w:after="0" w:line="240" w:lineRule="auto"/>
             </w:pPr>
             <w:r>
               <w:rPr>
@@ -5808,7 +5808,7 @@
           </w:tcPr>
           <w:p>
             <w:pPr>
-              <w:spacing w:after="20" w:line="240" w:lineRule="auto"/>
+              <w:spacing w:after="0" w:line="240" w:lineRule="auto"/>
             </w:pPr>
             <w:r>
               <w:rPr>
@@ -5822,7 +5822,7 @@
           </w:p>
           <w:p>
             <w:pPr>
-              <w:spacing w:after="30" w:line="252" w:lineRule="auto"/>
+              <w:spacing w:after="0" w:line="240" w:lineRule="auto"/>
             </w:pPr>
             <w:r>
               <w:rPr>
@@ -5854,7 +5854,7 @@
           </w:tcPr>
           <w:p>
             <w:pPr>
-              <w:spacing w:after="40" w:line="252" w:lineRule="auto"/>
+              <w:spacing w:after="0" w:line="240" w:lineRule="auto"/>
               <w:ind w:left="250" w:hanging="250"/>
             </w:pPr>
             <w:r>
@@ -5887,7 +5887,7 @@
           </w:p>
           <w:p>
             <w:pPr>
-              <w:spacing w:after="40" w:line="252" w:lineRule="auto"/>
+              <w:spacing w:after="0" w:line="240" w:lineRule="auto"/>
               <w:ind w:left="250" w:hanging="250"/>
             </w:pPr>
             <w:r>
@@ -5920,7 +5920,7 @@
           </w:p>
           <w:p>
             <w:pPr>
-              <w:spacing w:after="40" w:line="252" w:lineRule="auto"/>
+              <w:spacing w:after="0" w:line="240" w:lineRule="auto"/>
               <w:ind w:left="250" w:hanging="250"/>
             </w:pPr>
             <w:r>
@@ -5953,7 +5953,7 @@
           </w:p>
           <w:p>
             <w:pPr>
-              <w:spacing w:after="0" w:line="252" w:lineRule="auto"/>
+              <w:spacing w:after="0" w:line="240" w:lineRule="auto"/>
               <w:ind w:left="250" w:hanging="250"/>
             </w:pPr>
             <w:r>
@@ -5991,7 +5991,7 @@
           </w:tcPr>
           <w:p>
             <w:pPr>
-              <w:spacing w:after="0" w:line="252" w:lineRule="auto"/>
+              <w:spacing w:after="0" w:line="240" w:lineRule="auto"/>
             </w:pPr>
             <w:r>
               <w:rPr>
@@ -6008,7 +6008,7 @@
       <w:pPr>
         <w:keepNext/>
         <w:pageBreakBefore/>
-        <w:spacing w:after="16"/>
+        <w:spacing w:after="0"/>
       </w:pPr>
       <w:r>
         <w:rPr>
@@ -6026,7 +6026,7 @@
     <w:p>
       <w:pPr>
         <w:keepNext/>
-        <w:spacing w:after="60" w:line="240" w:lineRule="auto"/>
+        <w:spacing w:after="0" w:line="240" w:lineRule="auto"/>
       </w:pPr>
       <w:r>
         <w:rPr>
@@ -6040,7 +6040,7 @@
     <w:p>
       <w:pPr>
         <w:keepNext/>
-        <w:spacing w:after="110" w:line="264" w:lineRule="auto"/>
+        <w:spacing w:after="0" w:line="240" w:lineRule="auto"/>
       </w:pPr>
       <w:r>
         <w:rPr>
@@ -6056,7 +6056,7 @@
         <w:pBdr>
           <w:bottom w:val="single" w:sz="4" w:space="5" w:color="C9CDD2"/>
         </w:pBdr>
-        <w:spacing w:after="150" w:line="264" w:lineRule="auto"/>
+        <w:spacing w:after="0" w:line="240" w:lineRule="auto"/>
       </w:pPr>
     </w:p>
     <w:tbl>
@@ -6166,7 +6166,7 @@
           </w:tcPr>
           <w:p>
             <w:pPr>
-              <w:spacing w:after="20" w:line="240" w:lineRule="auto"/>
+              <w:spacing w:after="0" w:line="240" w:lineRule="auto"/>
             </w:pPr>
             <w:r>
               <w:rPr>
@@ -6180,7 +6180,7 @@
           </w:p>
           <w:p>
             <w:pPr>
-              <w:spacing w:after="30" w:line="252" w:lineRule="auto"/>
+              <w:spacing w:after="0" w:line="240" w:lineRule="auto"/>
             </w:pPr>
             <w:r>
               <w:rPr>
@@ -6212,7 +6212,7 @@
           </w:tcPr>
           <w:p>
             <w:pPr>
-              <w:spacing w:after="40" w:line="252" w:lineRule="auto"/>
+              <w:spacing w:after="0" w:line="240" w:lineRule="auto"/>
               <w:ind w:left="250" w:hanging="250"/>
             </w:pPr>
             <w:r>
@@ -6245,7 +6245,7 @@
           </w:p>
           <w:p>
             <w:pPr>
-              <w:spacing w:after="40" w:line="252" w:lineRule="auto"/>
+              <w:spacing w:after="0" w:line="240" w:lineRule="auto"/>
               <w:ind w:left="250" w:hanging="250"/>
             </w:pPr>
             <w:r>
@@ -6278,7 +6278,7 @@
           </w:p>
           <w:p>
             <w:pPr>
-              <w:spacing w:after="40" w:line="252" w:lineRule="auto"/>
+              <w:spacing w:after="0" w:line="240" w:lineRule="auto"/>
               <w:ind w:left="250" w:hanging="250"/>
             </w:pPr>
             <w:r>
@@ -6311,7 +6311,7 @@
           </w:p>
           <w:p>
             <w:pPr>
-              <w:spacing w:after="0" w:line="252" w:lineRule="auto"/>
+              <w:spacing w:after="0" w:line="240" w:lineRule="auto"/>
               <w:ind w:left="250" w:hanging="250"/>
             </w:pPr>
             <w:r>
@@ -6349,7 +6349,7 @@
           </w:tcPr>
           <w:p>
             <w:pPr>
-              <w:spacing w:after="0" w:line="252" w:lineRule="auto"/>
+              <w:spacing w:after="0" w:line="240" w:lineRule="auto"/>
             </w:pPr>
             <w:r>
               <w:rPr>
@@ -6371,7 +6371,7 @@
           </w:tcPr>
           <w:p>
             <w:pPr>
-              <w:spacing w:after="20" w:line="240" w:lineRule="auto"/>
+              <w:spacing w:after="0" w:line="240" w:lineRule="auto"/>
             </w:pPr>
             <w:r>
               <w:rPr>
@@ -6385,7 +6385,7 @@
           </w:p>
           <w:p>
             <w:pPr>
-              <w:spacing w:after="30" w:line="252" w:lineRule="auto"/>
+              <w:spacing w:after="0" w:line="240" w:lineRule="auto"/>
             </w:pPr>
             <w:r>
               <w:rPr>
@@ -6417,7 +6417,7 @@
           </w:tcPr>
           <w:p>
             <w:pPr>
-              <w:spacing w:after="40" w:line="252" w:lineRule="auto"/>
+              <w:spacing w:after="0" w:line="240" w:lineRule="auto"/>
               <w:ind w:left="250" w:hanging="250"/>
             </w:pPr>
             <w:r>
@@ -6450,7 +6450,7 @@
           </w:p>
           <w:p>
             <w:pPr>
-              <w:spacing w:after="40" w:line="252" w:lineRule="auto"/>
+              <w:spacing w:after="0" w:line="240" w:lineRule="auto"/>
               <w:ind w:left="250" w:hanging="250"/>
             </w:pPr>
             <w:r>
@@ -6483,7 +6483,7 @@
           </w:p>
           <w:p>
             <w:pPr>
-              <w:spacing w:after="40" w:line="252" w:lineRule="auto"/>
+              <w:spacing w:after="0" w:line="240" w:lineRule="auto"/>
               <w:ind w:left="250" w:hanging="250"/>
             </w:pPr>
             <w:r>
@@ -6516,7 +6516,7 @@
           </w:p>
           <w:p>
             <w:pPr>
-              <w:spacing w:after="0" w:line="252" w:lineRule="auto"/>
+              <w:spacing w:after="0" w:line="240" w:lineRule="auto"/>
               <w:ind w:left="250" w:hanging="250"/>
             </w:pPr>
             <w:r>
@@ -6554,7 +6554,7 @@
           </w:tcPr>
           <w:p>
             <w:pPr>
-              <w:spacing w:after="0" w:line="252" w:lineRule="auto"/>
+              <w:spacing w:after="0" w:line="240" w:lineRule="auto"/>
             </w:pPr>
             <w:r>
               <w:rPr>
@@ -6576,7 +6576,7 @@
           </w:tcPr>
           <w:p>
             <w:pPr>
-              <w:spacing w:after="20" w:line="240" w:lineRule="auto"/>
+              <w:spacing w:after="0" w:line="240" w:lineRule="auto"/>
             </w:pPr>
             <w:r>
               <w:rPr>
@@ -6590,7 +6590,7 @@
           </w:p>
           <w:p>
             <w:pPr>
-              <w:spacing w:after="30" w:line="252" w:lineRule="auto"/>
+              <w:spacing w:after="0" w:line="240" w:lineRule="auto"/>
             </w:pPr>
             <w:r>
               <w:rPr>
@@ -6622,7 +6622,7 @@
           </w:tcPr>
           <w:p>
             <w:pPr>
-              <w:spacing w:after="40" w:line="252" w:lineRule="auto"/>
+              <w:spacing w:after="0" w:line="240" w:lineRule="auto"/>
               <w:ind w:left="250" w:hanging="250"/>
             </w:pPr>
             <w:r>
@@ -6655,7 +6655,7 @@
           </w:p>
           <w:p>
             <w:pPr>
-              <w:spacing w:after="40" w:line="252" w:lineRule="auto"/>
+              <w:spacing w:after="0" w:line="240" w:lineRule="auto"/>
               <w:ind w:left="250" w:hanging="250"/>
             </w:pPr>
             <w:r>
@@ -6688,7 +6688,7 @@
           </w:p>
           <w:p>
             <w:pPr>
-              <w:spacing w:after="40" w:line="252" w:lineRule="auto"/>
+              <w:spacing w:after="0" w:line="240" w:lineRule="auto"/>
               <w:ind w:left="250" w:hanging="250"/>
             </w:pPr>
             <w:r>
@@ -6721,7 +6721,7 @@
           </w:p>
           <w:p>
             <w:pPr>
-              <w:spacing w:after="0" w:line="252" w:lineRule="auto"/>
+              <w:spacing w:after="0" w:line="240" w:lineRule="auto"/>
               <w:ind w:left="250" w:hanging="250"/>
             </w:pPr>
             <w:r>
@@ -6759,7 +6759,7 @@
           </w:tcPr>
           <w:p>
             <w:pPr>
-              <w:spacing w:after="0" w:line="252" w:lineRule="auto"/>
+              <w:spacing w:after="0" w:line="240" w:lineRule="auto"/>
             </w:pPr>
             <w:r>
               <w:rPr>
@@ -6781,7 +6781,7 @@
           </w:tcPr>
           <w:p>
             <w:pPr>
-              <w:spacing w:after="20" w:line="240" w:lineRule="auto"/>
+              <w:spacing w:after="0" w:line="240" w:lineRule="auto"/>
             </w:pPr>
             <w:r>
               <w:rPr>
@@ -6795,7 +6795,7 @@
           </w:p>
           <w:p>
             <w:pPr>
-              <w:spacing w:after="30" w:line="252" w:lineRule="auto"/>
+              <w:spacing w:after="0" w:line="240" w:lineRule="auto"/>
             </w:pPr>
             <w:r>
               <w:rPr>
@@ -6827,7 +6827,7 @@
           </w:tcPr>
           <w:p>
             <w:pPr>
-              <w:spacing w:after="40" w:line="252" w:lineRule="auto"/>
+              <w:spacing w:after="0" w:line="240" w:lineRule="auto"/>
               <w:ind w:left="250" w:hanging="250"/>
             </w:pPr>
             <w:r>
@@ -6860,7 +6860,7 @@
           </w:p>
           <w:p>
             <w:pPr>
-              <w:spacing w:after="40" w:line="252" w:lineRule="auto"/>
+              <w:spacing w:after="0" w:line="240" w:lineRule="auto"/>
               <w:ind w:left="250" w:hanging="250"/>
             </w:pPr>
             <w:r>
@@ -6893,7 +6893,7 @@
           </w:p>
           <w:p>
             <w:pPr>
-              <w:spacing w:after="40" w:line="252" w:lineRule="auto"/>
+              <w:spacing w:after="0" w:line="240" w:lineRule="auto"/>
               <w:ind w:left="250" w:hanging="250"/>
             </w:pPr>
             <w:r>
@@ -6926,7 +6926,7 @@
           </w:p>
           <w:p>
             <w:pPr>
-              <w:spacing w:after="0" w:line="252" w:lineRule="auto"/>
+              <w:spacing w:after="0" w:line="240" w:lineRule="auto"/>
               <w:ind w:left="250" w:hanging="250"/>
             </w:pPr>
             <w:r>
@@ -6964,7 +6964,7 @@
           </w:tcPr>
           <w:p>
             <w:pPr>
-              <w:spacing w:after="0" w:line="252" w:lineRule="auto"/>
+              <w:spacing w:after="0" w:line="240" w:lineRule="auto"/>
             </w:pPr>
             <w:r>
               <w:rPr>
@@ -6986,7 +6986,7 @@
           </w:tcPr>
           <w:p>
             <w:pPr>
-              <w:spacing w:after="20" w:line="240" w:lineRule="auto"/>
+              <w:spacing w:after="0" w:line="240" w:lineRule="auto"/>
             </w:pPr>
             <w:r>
               <w:rPr>
@@ -7000,7 +7000,7 @@
           </w:p>
           <w:p>
             <w:pPr>
-              <w:spacing w:after="30" w:line="252" w:lineRule="auto"/>
+              <w:spacing w:after="0" w:line="240" w:lineRule="auto"/>
             </w:pPr>
             <w:r>
               <w:rPr>
@@ -7032,7 +7032,7 @@
           </w:tcPr>
           <w:p>
             <w:pPr>
-              <w:spacing w:after="40" w:line="252" w:lineRule="auto"/>
+              <w:spacing w:after="0" w:line="240" w:lineRule="auto"/>
               <w:ind w:left="250" w:hanging="250"/>
             </w:pPr>
             <w:r>
@@ -7065,7 +7065,7 @@
           </w:p>
           <w:p>
             <w:pPr>
-              <w:spacing w:after="40" w:line="252" w:lineRule="auto"/>
+              <w:spacing w:after="0" w:line="240" w:lineRule="auto"/>
               <w:ind w:left="250" w:hanging="250"/>
             </w:pPr>
             <w:r>
@@ -7098,7 +7098,7 @@
           </w:p>
           <w:p>
             <w:pPr>
-              <w:spacing w:after="40" w:line="252" w:lineRule="auto"/>
+              <w:spacing w:after="0" w:line="240" w:lineRule="auto"/>
               <w:ind w:left="250" w:hanging="250"/>
             </w:pPr>
             <w:r>
@@ -7131,7 +7131,7 @@
           </w:p>
           <w:p>
             <w:pPr>
-              <w:spacing w:after="0" w:line="252" w:lineRule="auto"/>
+              <w:spacing w:after="0" w:line="240" w:lineRule="auto"/>
               <w:ind w:left="250" w:hanging="250"/>
             </w:pPr>
             <w:r>
@@ -7169,7 +7169,7 @@
           </w:tcPr>
           <w:p>
             <w:pPr>
-              <w:spacing w:after="0" w:line="252" w:lineRule="auto"/>
+              <w:spacing w:after="0" w:line="240" w:lineRule="auto"/>
             </w:pPr>
             <w:r>
               <w:rPr>
@@ -7191,7 +7191,7 @@
           </w:tcPr>
           <w:p>
             <w:pPr>
-              <w:spacing w:after="20" w:line="240" w:lineRule="auto"/>
+              <w:spacing w:after="0" w:line="240" w:lineRule="auto"/>
             </w:pPr>
             <w:r>
               <w:rPr>
@@ -7206,7 +7206,7 @@
           </w:p>
           <w:p>
             <w:pPr>
-              <w:spacing w:after="30" w:line="252" w:lineRule="auto"/>
+              <w:spacing w:after="0" w:line="240" w:lineRule="auto"/>
             </w:pPr>
             <w:r>
               <w:rPr>
@@ -7238,7 +7238,7 @@
           </w:tcPr>
           <w:p>
             <w:pPr>
-              <w:spacing w:after="40" w:line="252" w:lineRule="auto"/>
+              <w:spacing w:after="0" w:line="240" w:lineRule="auto"/>
               <w:ind w:left="250" w:hanging="250"/>
             </w:pPr>
             <w:r>
@@ -7271,7 +7271,7 @@
           </w:p>
           <w:p>
             <w:pPr>
-              <w:spacing w:after="40" w:line="252" w:lineRule="auto"/>
+              <w:spacing w:after="0" w:line="240" w:lineRule="auto"/>
               <w:ind w:left="250" w:hanging="250"/>
             </w:pPr>
             <w:r>
@@ -7304,7 +7304,7 @@
           </w:p>
           <w:p>
             <w:pPr>
-              <w:spacing w:after="40" w:line="252" w:lineRule="auto"/>
+              <w:spacing w:after="0" w:line="240" w:lineRule="auto"/>
               <w:ind w:left="250" w:hanging="250"/>
             </w:pPr>
             <w:r>
@@ -7337,7 +7337,7 @@
           </w:p>
           <w:p>
             <w:pPr>
-              <w:spacing w:after="0" w:line="252" w:lineRule="auto"/>
+              <w:spacing w:after="0" w:line="240" w:lineRule="auto"/>
               <w:ind w:left="250" w:hanging="250"/>
             </w:pPr>
             <w:r>
@@ -7375,7 +7375,7 @@
           </w:tcPr>
           <w:p>
             <w:pPr>
-              <w:spacing w:after="0" w:line="252" w:lineRule="auto"/>
+              <w:spacing w:after="0" w:line="240" w:lineRule="auto"/>
             </w:pPr>
             <w:r>
               <w:rPr>
@@ -7397,7 +7397,7 @@
           </w:tcPr>
           <w:p>
             <w:pPr>
-              <w:spacing w:after="20" w:line="240" w:lineRule="auto"/>
+              <w:spacing w:after="0" w:line="240" w:lineRule="auto"/>
             </w:pPr>
             <w:r>
               <w:rPr>
@@ -7411,7 +7411,7 @@
           </w:p>
           <w:p>
             <w:pPr>
-              <w:spacing w:after="30" w:line="252" w:lineRule="auto"/>
+              <w:spacing w:after="0" w:line="240" w:lineRule="auto"/>
             </w:pPr>
             <w:r>
               <w:rPr>
@@ -7443,7 +7443,7 @@
           </w:tcPr>
           <w:p>
             <w:pPr>
-              <w:spacing w:after="40" w:line="252" w:lineRule="auto"/>
+              <w:spacing w:after="0" w:line="240" w:lineRule="auto"/>
               <w:ind w:left="250" w:hanging="250"/>
             </w:pPr>
             <w:r>
@@ -7476,7 +7476,7 @@
           </w:p>
           <w:p>
             <w:pPr>
-              <w:spacing w:after="40" w:line="252" w:lineRule="auto"/>
+              <w:spacing w:after="0" w:line="240" w:lineRule="auto"/>
               <w:ind w:left="250" w:hanging="250"/>
             </w:pPr>
             <w:r>
@@ -7509,7 +7509,7 @@
           </w:p>
           <w:p>
             <w:pPr>
-              <w:spacing w:after="40" w:line="252" w:lineRule="auto"/>
+              <w:spacing w:after="0" w:line="240" w:lineRule="auto"/>
               <w:ind w:left="250" w:hanging="250"/>
             </w:pPr>
             <w:r>
@@ -7542,7 +7542,7 @@
           </w:p>
           <w:p>
             <w:pPr>
-              <w:spacing w:after="0" w:line="252" w:lineRule="auto"/>
+              <w:spacing w:after="0" w:line="240" w:lineRule="auto"/>
               <w:ind w:left="250" w:hanging="250"/>
             </w:pPr>
             <w:r>
@@ -7580,7 +7580,7 @@
           </w:tcPr>
           <w:p>
             <w:pPr>
-              <w:spacing w:after="0" w:line="252" w:lineRule="auto"/>
+              <w:spacing w:after="0" w:line="240" w:lineRule="auto"/>
             </w:pPr>
             <w:r>
               <w:rPr>
@@ -7602,7 +7602,7 @@
           </w:tcPr>
           <w:p>
             <w:pPr>
-              <w:spacing w:after="20" w:line="240" w:lineRule="auto"/>
+              <w:spacing w:after="0" w:line="240" w:lineRule="auto"/>
             </w:pPr>
             <w:r>
               <w:rPr>
@@ -7616,7 +7616,7 @@
           </w:p>
           <w:p>
             <w:pPr>
-              <w:spacing w:after="30" w:line="252" w:lineRule="auto"/>
+              <w:spacing w:after="0" w:line="240" w:lineRule="auto"/>
             </w:pPr>
             <w:r>
               <w:rPr>
@@ -7648,7 +7648,7 @@
           </w:tcPr>
           <w:p>
             <w:pPr>
-              <w:spacing w:after="40" w:line="252" w:lineRule="auto"/>
+              <w:spacing w:after="0" w:line="240" w:lineRule="auto"/>
               <w:ind w:left="250" w:hanging="250"/>
             </w:pPr>
             <w:r>
@@ -7681,7 +7681,7 @@
           </w:p>
           <w:p>
             <w:pPr>
-              <w:spacing w:after="40" w:line="252" w:lineRule="auto"/>
+              <w:spacing w:after="0" w:line="240" w:lineRule="auto"/>
               <w:ind w:left="250" w:hanging="250"/>
             </w:pPr>
             <w:r>
@@ -7714,7 +7714,7 @@
           </w:p>
           <w:p>
             <w:pPr>
-              <w:spacing w:after="40" w:line="252" w:lineRule="auto"/>
+              <w:spacing w:after="0" w:line="240" w:lineRule="auto"/>
               <w:ind w:left="250" w:hanging="250"/>
             </w:pPr>
             <w:r>
@@ -7747,7 +7747,7 @@
           </w:p>
           <w:p>
             <w:pPr>
-              <w:spacing w:after="0" w:line="252" w:lineRule="auto"/>
+              <w:spacing w:after="0" w:line="240" w:lineRule="auto"/>
               <w:ind w:left="250" w:hanging="250"/>
             </w:pPr>
             <w:r>
@@ -7785,7 +7785,7 @@
           </w:tcPr>
           <w:p>
             <w:pPr>
-              <w:spacing w:after="0" w:line="252" w:lineRule="auto"/>
+              <w:spacing w:after="0" w:line="240" w:lineRule="auto"/>
             </w:pPr>
             <w:r>
               <w:rPr>
@@ -7802,7 +7802,7 @@
       <w:pPr>
         <w:keepNext/>
         <w:pageBreakBefore/>
-        <w:spacing w:after="16"/>
+        <w:spacing w:after="0"/>
       </w:pPr>
       <w:r>
         <w:rPr>
@@ -7820,7 +7820,7 @@
     <w:p>
       <w:pPr>
         <w:keepNext/>
-        <w:spacing w:after="60" w:line="240" w:lineRule="auto"/>
+        <w:spacing w:after="0" w:line="240" w:lineRule="auto"/>
       </w:pPr>
       <w:r>
         <w:rPr>
@@ -7834,7 +7834,7 @@
     <w:p>
       <w:pPr>
         <w:keepNext/>
-        <w:spacing w:after="110" w:line="264" w:lineRule="auto"/>
+        <w:spacing w:after="0" w:line="240" w:lineRule="auto"/>
       </w:pPr>
       <w:r>
         <w:rPr>
@@ -7850,7 +7850,7 @@
         <w:pBdr>
           <w:bottom w:val="single" w:sz="4" w:space="5" w:color="C9CDD2"/>
         </w:pBdr>
-        <w:spacing w:after="150" w:line="264" w:lineRule="auto"/>
+        <w:spacing w:after="0" w:line="240" w:lineRule="auto"/>
       </w:pPr>
     </w:p>
     <w:tbl>
@@ -7960,7 +7960,7 @@
           </w:tcPr>
           <w:p>
             <w:pPr>
-              <w:spacing w:after="20" w:line="240" w:lineRule="auto"/>
+              <w:spacing w:after="0" w:line="240" w:lineRule="auto"/>
             </w:pPr>
             <w:r>
               <w:rPr>
@@ -7974,7 +7974,7 @@
           </w:p>
           <w:p>
             <w:pPr>
-              <w:spacing w:after="30" w:line="252" w:lineRule="auto"/>
+              <w:spacing w:after="0" w:line="240" w:lineRule="auto"/>
             </w:pPr>
             <w:r>
               <w:rPr>
@@ -8006,7 +8006,7 @@
           </w:tcPr>
           <w:p>
             <w:pPr>
-              <w:spacing w:after="40" w:line="252" w:lineRule="auto"/>
+              <w:spacing w:after="0" w:line="240" w:lineRule="auto"/>
               <w:ind w:left="250" w:hanging="250"/>
             </w:pPr>
             <w:r>
@@ -8039,7 +8039,7 @@
           </w:p>
           <w:p>
             <w:pPr>
-              <w:spacing w:after="40" w:line="252" w:lineRule="auto"/>
+              <w:spacing w:after="0" w:line="240" w:lineRule="auto"/>
               <w:ind w:left="250" w:hanging="250"/>
             </w:pPr>
             <w:r>
@@ -8072,7 +8072,7 @@
           </w:p>
           <w:p>
             <w:pPr>
-              <w:spacing w:after="40" w:line="252" w:lineRule="auto"/>
+              <w:spacing w:after="0" w:line="240" w:lineRule="auto"/>
               <w:ind w:left="250" w:hanging="250"/>
             </w:pPr>
             <w:r>
@@ -8105,7 +8105,7 @@
           </w:p>
           <w:p>
             <w:pPr>
-              <w:spacing w:after="0" w:line="252" w:lineRule="auto"/>
+              <w:spacing w:after="0" w:line="240" w:lineRule="auto"/>
               <w:ind w:left="250" w:hanging="250"/>
             </w:pPr>
             <w:r>
@@ -8143,7 +8143,7 @@
           </w:tcPr>
           <w:p>
             <w:pPr>
-              <w:spacing w:after="0" w:line="252" w:lineRule="auto"/>
+              <w:spacing w:after="0" w:line="240" w:lineRule="auto"/>
             </w:pPr>
             <w:r>
               <w:rPr>
@@ -8165,7 +8165,7 @@
           </w:tcPr>
           <w:p>
             <w:pPr>
-              <w:spacing w:after="20" w:line="240" w:lineRule="auto"/>
+              <w:spacing w:after="0" w:line="240" w:lineRule="auto"/>
             </w:pPr>
             <w:r>
               <w:rPr>
@@ -8179,7 +8179,7 @@
           </w:p>
           <w:p>
             <w:pPr>
-              <w:spacing w:after="30" w:line="252" w:lineRule="auto"/>
+              <w:spacing w:after="0" w:line="240" w:lineRule="auto"/>
             </w:pPr>
             <w:r>
               <w:rPr>
@@ -8211,7 +8211,7 @@
           </w:tcPr>
           <w:p>
             <w:pPr>
-              <w:spacing w:after="40" w:line="252" w:lineRule="auto"/>
+              <w:spacing w:after="0" w:line="240" w:lineRule="auto"/>
               <w:ind w:left="250" w:hanging="250"/>
             </w:pPr>
             <w:r>
@@ -8244,7 +8244,7 @@
           </w:p>
           <w:p>
             <w:pPr>
-              <w:spacing w:after="40" w:line="252" w:lineRule="auto"/>
+              <w:spacing w:after="0" w:line="240" w:lineRule="auto"/>
               <w:ind w:left="250" w:hanging="250"/>
             </w:pPr>
             <w:r>
@@ -8277,7 +8277,7 @@
           </w:p>
           <w:p>
             <w:pPr>
-              <w:spacing w:after="40" w:line="252" w:lineRule="auto"/>
+              <w:spacing w:after="0" w:line="240" w:lineRule="auto"/>
               <w:ind w:left="250" w:hanging="250"/>
             </w:pPr>
             <w:r>
@@ -8310,7 +8310,7 @@
           </w:p>
           <w:p>
             <w:pPr>
-              <w:spacing w:after="0" w:line="252" w:lineRule="auto"/>
+              <w:spacing w:after="0" w:line="240" w:lineRule="auto"/>
               <w:ind w:left="250" w:hanging="250"/>
             </w:pPr>
             <w:r>
@@ -8348,7 +8348,7 @@
           </w:tcPr>
           <w:p>
             <w:pPr>
-              <w:spacing w:after="0" w:line="252" w:lineRule="auto"/>
+              <w:spacing w:after="0" w:line="240" w:lineRule="auto"/>
             </w:pPr>
             <w:r>
               <w:rPr>
@@ -8370,7 +8370,7 @@
           </w:tcPr>
           <w:p>
             <w:pPr>
-              <w:spacing w:after="20" w:line="240" w:lineRule="auto"/>
+              <w:spacing w:after="0" w:line="240" w:lineRule="auto"/>
             </w:pPr>
             <w:r>
               <w:rPr>
@@ -8384,7 +8384,7 @@
           </w:p>
           <w:p>
             <w:pPr>
-              <w:spacing w:after="30" w:line="252" w:lineRule="auto"/>
+              <w:spacing w:after="0" w:line="240" w:lineRule="auto"/>
             </w:pPr>
             <w:r>
               <w:rPr>
@@ -8416,7 +8416,7 @@
           </w:tcPr>
           <w:p>
             <w:pPr>
-              <w:spacing w:after="40" w:line="252" w:lineRule="auto"/>
+              <w:spacing w:after="0" w:line="240" w:lineRule="auto"/>
               <w:ind w:left="250" w:hanging="250"/>
             </w:pPr>
             <w:r>
@@ -8449,7 +8449,7 @@
           </w:p>
           <w:p>
             <w:pPr>
-              <w:spacing w:after="40" w:line="252" w:lineRule="auto"/>
+              <w:spacing w:after="0" w:line="240" w:lineRule="auto"/>
               <w:ind w:left="250" w:hanging="250"/>
             </w:pPr>
             <w:r>
@@ -8482,7 +8482,7 @@
           </w:p>
           <w:p>
             <w:pPr>
-              <w:spacing w:after="40" w:line="252" w:lineRule="auto"/>
+              <w:spacing w:after="0" w:line="240" w:lineRule="auto"/>
               <w:ind w:left="250" w:hanging="250"/>
             </w:pPr>
             <w:r>
@@ -8515,7 +8515,7 @@
           </w:p>
           <w:p>
             <w:pPr>
-              <w:spacing w:after="0" w:line="252" w:lineRule="auto"/>
+              <w:spacing w:after="0" w:line="240" w:lineRule="auto"/>
               <w:ind w:left="250" w:hanging="250"/>
             </w:pPr>
             <w:r>
@@ -8553,7 +8553,7 @@
           </w:tcPr>
           <w:p>
             <w:pPr>
-              <w:spacing w:after="0" w:line="252" w:lineRule="auto"/>
+              <w:spacing w:after="0" w:line="240" w:lineRule="auto"/>
             </w:pPr>
             <w:r>
               <w:rPr>
@@ -8575,7 +8575,7 @@
           </w:tcPr>
           <w:p>
             <w:pPr>
-              <w:spacing w:after="20" w:line="240" w:lineRule="auto"/>
+              <w:spacing w:after="0" w:line="240" w:lineRule="auto"/>
             </w:pPr>
             <w:r>
               <w:rPr>
@@ -8589,7 +8589,7 @@
           </w:p>
           <w:p>
             <w:pPr>
-              <w:spacing w:after="30" w:line="252" w:lineRule="auto"/>
+              <w:spacing w:after="0" w:line="240" w:lineRule="auto"/>
             </w:pPr>
             <w:r>
               <w:rPr>
@@ -8621,7 +8621,7 @@
           </w:tcPr>
           <w:p>
             <w:pPr>
-              <w:spacing w:after="40" w:line="252" w:lineRule="auto"/>
+              <w:spacing w:after="0" w:line="240" w:lineRule="auto"/>
               <w:ind w:left="250" w:hanging="250"/>
             </w:pPr>
             <w:r>
@@ -8654,7 +8654,7 @@
           </w:p>
           <w:p>
             <w:pPr>
-              <w:spacing w:after="40" w:line="252" w:lineRule="auto"/>
+              <w:spacing w:after="0" w:line="240" w:lineRule="auto"/>
               <w:ind w:left="250" w:hanging="250"/>
             </w:pPr>
             <w:r>
@@ -8687,7 +8687,7 @@
           </w:p>
           <w:p>
             <w:pPr>
-              <w:spacing w:after="40" w:line="252" w:lineRule="auto"/>
+              <w:spacing w:after="0" w:line="240" w:lineRule="auto"/>
               <w:ind w:left="250" w:hanging="250"/>
             </w:pPr>
             <w:r>
@@ -8720,7 +8720,7 @@
           </w:p>
           <w:p>
             <w:pPr>
-              <w:spacing w:after="0" w:line="252" w:lineRule="auto"/>
+              <w:spacing w:after="0" w:line="240" w:lineRule="auto"/>
               <w:ind w:left="250" w:hanging="250"/>
             </w:pPr>
             <w:r>
@@ -8758,7 +8758,7 @@
           </w:tcPr>
           <w:p>
             <w:pPr>
-              <w:spacing w:after="0" w:line="252" w:lineRule="auto"/>
+              <w:spacing w:after="0" w:line="240" w:lineRule="auto"/>
             </w:pPr>
             <w:r>
               <w:rPr>
@@ -8780,7 +8780,7 @@
           </w:tcPr>
           <w:p>
             <w:pPr>
-              <w:spacing w:after="20" w:line="240" w:lineRule="auto"/>
+              <w:spacing w:after="0" w:line="240" w:lineRule="auto"/>
             </w:pPr>
             <w:r>
               <w:rPr>
@@ -8794,7 +8794,7 @@
           </w:p>
           <w:p>
             <w:pPr>
-              <w:spacing w:after="30" w:line="252" w:lineRule="auto"/>
+              <w:spacing w:after="0" w:line="240" w:lineRule="auto"/>
             </w:pPr>
             <w:r>
               <w:rPr>
@@ -8826,7 +8826,7 @@
           </w:tcPr>
           <w:p>
             <w:pPr>
-              <w:spacing w:after="40" w:line="252" w:lineRule="auto"/>
+              <w:spacing w:after="0" w:line="240" w:lineRule="auto"/>
               <w:ind w:left="250" w:hanging="250"/>
             </w:pPr>
             <w:r>
@@ -8859,7 +8859,7 @@
           </w:p>
           <w:p>
             <w:pPr>
-              <w:spacing w:after="40" w:line="252" w:lineRule="auto"/>
+              <w:spacing w:after="0" w:line="240" w:lineRule="auto"/>
               <w:ind w:left="250" w:hanging="250"/>
             </w:pPr>
             <w:r>
@@ -8892,7 +8892,7 @@
           </w:p>
           <w:p>
             <w:pPr>
-              <w:spacing w:after="40" w:line="252" w:lineRule="auto"/>
+              <w:spacing w:after="0" w:line="240" w:lineRule="auto"/>
               <w:ind w:left="250" w:hanging="250"/>
             </w:pPr>
             <w:r>
@@ -8925,7 +8925,7 @@
           </w:p>
           <w:p>
             <w:pPr>
-              <w:spacing w:after="0" w:line="252" w:lineRule="auto"/>
+              <w:spacing w:after="0" w:line="240" w:lineRule="auto"/>
               <w:ind w:left="250" w:hanging="250"/>
             </w:pPr>
             <w:r>
@@ -8963,7 +8963,7 @@
           </w:tcPr>
           <w:p>
             <w:pPr>
-              <w:spacing w:after="0" w:line="252" w:lineRule="auto"/>
+              <w:spacing w:after="0" w:line="240" w:lineRule="auto"/>
             </w:pPr>
             <w:r>
               <w:rPr>
@@ -8985,7 +8985,7 @@
           </w:tcPr>
           <w:p>
             <w:pPr>
-              <w:spacing w:after="20" w:line="240" w:lineRule="auto"/>
+              <w:spacing w:after="0" w:line="240" w:lineRule="auto"/>
             </w:pPr>
             <w:r>
               <w:rPr>
@@ -9000,7 +9000,7 @@
           </w:p>
           <w:p>
             <w:pPr>
-              <w:spacing w:after="30" w:line="252" w:lineRule="auto"/>
+              <w:spacing w:after="0" w:line="240" w:lineRule="auto"/>
             </w:pPr>
             <w:r>
               <w:rPr>
@@ -9032,7 +9032,7 @@
           </w:tcPr>
           <w:p>
             <w:pPr>
-              <w:spacing w:after="40" w:line="252" w:lineRule="auto"/>
+              <w:spacing w:after="0" w:line="240" w:lineRule="auto"/>
               <w:ind w:left="250" w:hanging="250"/>
             </w:pPr>
             <w:r>
@@ -9065,7 +9065,7 @@
           </w:p>
           <w:p>
             <w:pPr>
-              <w:spacing w:after="40" w:line="252" w:lineRule="auto"/>
+              <w:spacing w:after="0" w:line="240" w:lineRule="auto"/>
               <w:ind w:left="250" w:hanging="250"/>
             </w:pPr>
             <w:r>
@@ -9098,7 +9098,7 @@
           </w:p>
           <w:p>
             <w:pPr>
-              <w:spacing w:after="40" w:line="252" w:lineRule="auto"/>
+              <w:spacing w:after="0" w:line="240" w:lineRule="auto"/>
               <w:ind w:left="250" w:hanging="250"/>
             </w:pPr>
             <w:r>
@@ -9131,7 +9131,7 @@
           </w:p>
           <w:p>
             <w:pPr>
-              <w:spacing w:after="0" w:line="252" w:lineRule="auto"/>
+              <w:spacing w:after="0" w:line="240" w:lineRule="auto"/>
               <w:ind w:left="250" w:hanging="250"/>
             </w:pPr>
             <w:r>
@@ -9169,7 +9169,7 @@
           </w:tcPr>
           <w:p>
             <w:pPr>
-              <w:spacing w:after="0" w:line="252" w:lineRule="auto"/>
+              <w:spacing w:after="0" w:line="240" w:lineRule="auto"/>
             </w:pPr>
             <w:r>
               <w:rPr>
@@ -9191,7 +9191,7 @@
           </w:tcPr>
           <w:p>
             <w:pPr>
-              <w:spacing w:after="20" w:line="240" w:lineRule="auto"/>
+              <w:spacing w:after="0" w:line="240" w:lineRule="auto"/>
             </w:pPr>
             <w:r>
               <w:rPr>
@@ -9205,7 +9205,7 @@
           </w:p>
           <w:p>
             <w:pPr>
-              <w:spacing w:after="30" w:line="252" w:lineRule="auto"/>
+              <w:spacing w:after="0" w:line="240" w:lineRule="auto"/>
             </w:pPr>
             <w:r>
               <w:rPr>
@@ -9237,7 +9237,7 @@
           </w:tcPr>
           <w:p>
             <w:pPr>
-              <w:spacing w:after="40" w:line="252" w:lineRule="auto"/>
+              <w:spacing w:after="0" w:line="240" w:lineRule="auto"/>
               <w:ind w:left="250" w:hanging="250"/>
             </w:pPr>
             <w:r>
@@ -9270,7 +9270,7 @@
           </w:p>
           <w:p>
             <w:pPr>
-              <w:spacing w:after="40" w:line="252" w:lineRule="auto"/>
+              <w:spacing w:after="0" w:line="240" w:lineRule="auto"/>
               <w:ind w:left="250" w:hanging="250"/>
             </w:pPr>
             <w:r>
@@ -9303,7 +9303,7 @@
           </w:p>
           <w:p>
             <w:pPr>
-              <w:spacing w:after="40" w:line="252" w:lineRule="auto"/>
+              <w:spacing w:after="0" w:line="240" w:lineRule="auto"/>
               <w:ind w:left="250" w:hanging="250"/>
             </w:pPr>
             <w:r>
@@ -9336,7 +9336,7 @@
           </w:p>
           <w:p>
             <w:pPr>
-              <w:spacing w:after="0" w:line="252" w:lineRule="auto"/>
+              <w:spacing w:after="0" w:line="240" w:lineRule="auto"/>
               <w:ind w:left="250" w:hanging="250"/>
             </w:pPr>
             <w:r>
@@ -9374,7 +9374,7 @@
           </w:tcPr>
           <w:p>
             <w:pPr>
-              <w:spacing w:after="0" w:line="252" w:lineRule="auto"/>
+              <w:spacing w:after="0" w:line="240" w:lineRule="auto"/>
             </w:pPr>
             <w:r>
               <w:rPr>
@@ -9396,7 +9396,7 @@
           </w:tcPr>
           <w:p>
             <w:pPr>
-              <w:spacing w:after="20" w:line="240" w:lineRule="auto"/>
+              <w:spacing w:after="0" w:line="240" w:lineRule="auto"/>
             </w:pPr>
             <w:r>
               <w:rPr>
@@ -9410,7 +9410,7 @@
           </w:p>
           <w:p>
             <w:pPr>
-              <w:spacing w:after="30" w:line="252" w:lineRule="auto"/>
+              <w:spacing w:after="0" w:line="240" w:lineRule="auto"/>
             </w:pPr>
             <w:r>
               <w:rPr>
@@ -9442,7 +9442,7 @@
           </w:tcPr>
           <w:p>
             <w:pPr>
-              <w:spacing w:after="40" w:line="252" w:lineRule="auto"/>
+              <w:spacing w:after="0" w:line="240" w:lineRule="auto"/>
               <w:ind w:left="250" w:hanging="250"/>
             </w:pPr>
             <w:r>
@@ -9475,7 +9475,7 @@
           </w:p>
           <w:p>
             <w:pPr>
-              <w:spacing w:after="40" w:line="252" w:lineRule="auto"/>
+              <w:spacing w:after="0" w:line="240" w:lineRule="auto"/>
               <w:ind w:left="250" w:hanging="250"/>
             </w:pPr>
             <w:r>
@@ -9508,7 +9508,7 @@
           </w:p>
           <w:p>
             <w:pPr>
-              <w:spacing w:after="40" w:line="252" w:lineRule="auto"/>
+              <w:spacing w:after="0" w:line="240" w:lineRule="auto"/>
               <w:ind w:left="250" w:hanging="250"/>
             </w:pPr>
             <w:r>
@@ -9541,7 +9541,7 @@
           </w:p>
           <w:p>
             <w:pPr>
-              <w:spacing w:after="0" w:line="252" w:lineRule="auto"/>
+              <w:spacing w:after="0" w:line="240" w:lineRule="auto"/>
               <w:ind w:left="250" w:hanging="250"/>
             </w:pPr>
             <w:r>
@@ -9579,7 +9579,7 @@
           </w:tcPr>
           <w:p>
             <w:pPr>
-              <w:spacing w:after="0" w:line="252" w:lineRule="auto"/>
+              <w:spacing w:after="0" w:line="240" w:lineRule="auto"/>
             </w:pPr>
             <w:r>
               <w:rPr>
@@ -9596,7 +9596,7 @@
       <w:pPr>
         <w:keepNext/>
         <w:pageBreakBefore/>
-        <w:spacing w:after="16"/>
+        <w:spacing w:after="0"/>
       </w:pPr>
       <w:r>
         <w:rPr>
@@ -9614,7 +9614,7 @@
     <w:p>
       <w:pPr>
         <w:keepNext/>
-        <w:spacing w:after="60" w:line="240" w:lineRule="auto"/>
+        <w:spacing w:after="0" w:line="240" w:lineRule="auto"/>
       </w:pPr>
       <w:r>
         <w:rPr>
@@ -9628,7 +9628,7 @@
     <w:p>
       <w:pPr>
         <w:keepNext/>
-        <w:spacing w:after="110" w:line="264" w:lineRule="auto"/>
+        <w:spacing w:after="0" w:line="240" w:lineRule="auto"/>
       </w:pPr>
       <w:r>
         <w:rPr>
@@ -9644,7 +9644,7 @@
         <w:pBdr>
           <w:bottom w:val="single" w:sz="4" w:space="5" w:color="C9CDD2"/>
         </w:pBdr>
-        <w:spacing w:after="150" w:line="264" w:lineRule="auto"/>
+        <w:spacing w:after="0" w:line="240" w:lineRule="auto"/>
       </w:pPr>
     </w:p>
     <w:tbl>
@@ -9754,7 +9754,7 @@
           </w:tcPr>
           <w:p>
             <w:pPr>
-              <w:spacing w:after="20" w:line="240" w:lineRule="auto"/>
+              <w:spacing w:after="0" w:line="240" w:lineRule="auto"/>
             </w:pPr>
             <w:r>
               <w:rPr>
@@ -9768,7 +9768,7 @@
           </w:p>
           <w:p>
             <w:pPr>
-              <w:spacing w:after="30" w:line="252" w:lineRule="auto"/>
+              <w:spacing w:after="0" w:line="240" w:lineRule="auto"/>
             </w:pPr>
             <w:r>
               <w:rPr>
@@ -9800,7 +9800,7 @@
           </w:tcPr>
           <w:p>
             <w:pPr>
-              <w:spacing w:after="40" w:line="252" w:lineRule="auto"/>
+              <w:spacing w:after="0" w:line="240" w:lineRule="auto"/>
               <w:ind w:left="250" w:hanging="250"/>
             </w:pPr>
             <w:r>
@@ -9833,7 +9833,7 @@
           </w:p>
           <w:p>
             <w:pPr>
-              <w:spacing w:after="40" w:line="252" w:lineRule="auto"/>
+              <w:spacing w:after="0" w:line="240" w:lineRule="auto"/>
               <w:ind w:left="250" w:hanging="250"/>
             </w:pPr>
             <w:r>
@@ -9866,7 +9866,7 @@
           </w:p>
           <w:p>
             <w:pPr>
-              <w:spacing w:after="40" w:line="252" w:lineRule="auto"/>
+              <w:spacing w:after="0" w:line="240" w:lineRule="auto"/>
               <w:ind w:left="250" w:hanging="250"/>
             </w:pPr>
             <w:r>
@@ -9899,7 +9899,7 @@
           </w:p>
           <w:p>
             <w:pPr>
-              <w:spacing w:after="0" w:line="252" w:lineRule="auto"/>
+              <w:spacing w:after="0" w:line="240" w:lineRule="auto"/>
               <w:ind w:left="250" w:hanging="250"/>
             </w:pPr>
             <w:r>
@@ -9937,7 +9937,7 @@
           </w:tcPr>
           <w:p>
             <w:pPr>
-              <w:spacing w:after="0" w:line="252" w:lineRule="auto"/>
+              <w:spacing w:after="0" w:line="240" w:lineRule="auto"/>
             </w:pPr>
             <w:r>
               <w:rPr>
@@ -9959,7 +9959,7 @@
           </w:tcPr>
           <w:p>
             <w:pPr>
-              <w:spacing w:after="20" w:line="240" w:lineRule="auto"/>
+              <w:spacing w:after="0" w:line="240" w:lineRule="auto"/>
             </w:pPr>
             <w:r>
               <w:rPr>
@@ -9973,7 +9973,7 @@
           </w:p>
           <w:p>
             <w:pPr>
-              <w:spacing w:after="30" w:line="252" w:lineRule="auto"/>
+              <w:spacing w:after="0" w:line="240" w:lineRule="auto"/>
             </w:pPr>
             <w:r>
               <w:rPr>
@@ -10005,7 +10005,7 @@
           </w:tcPr>
           <w:p>
             <w:pPr>
-              <w:spacing w:after="40" w:line="252" w:lineRule="auto"/>
+              <w:spacing w:after="0" w:line="240" w:lineRule="auto"/>
               <w:ind w:left="250" w:hanging="250"/>
             </w:pPr>
             <w:r>
@@ -10038,7 +10038,7 @@
           </w:p>
           <w:p>
             <w:pPr>
-              <w:spacing w:after="40" w:line="252" w:lineRule="auto"/>
+              <w:spacing w:after="0" w:line="240" w:lineRule="auto"/>
               <w:ind w:left="250" w:hanging="250"/>
             </w:pPr>
             <w:r>
@@ -10071,7 +10071,7 @@
           </w:p>
           <w:p>
             <w:pPr>
-              <w:spacing w:after="40" w:line="252" w:lineRule="auto"/>
+              <w:spacing w:after="0" w:line="240" w:lineRule="auto"/>
               <w:ind w:left="250" w:hanging="250"/>
             </w:pPr>
             <w:r>
@@ -10104,7 +10104,7 @@
           </w:p>
           <w:p>
             <w:pPr>
-              <w:spacing w:after="0" w:line="252" w:lineRule="auto"/>
+              <w:spacing w:after="0" w:line="240" w:lineRule="auto"/>
               <w:ind w:left="250" w:hanging="250"/>
             </w:pPr>
             <w:r>
@@ -10142,7 +10142,7 @@
           </w:tcPr>
           <w:p>
             <w:pPr>
-              <w:spacing w:after="0" w:line="252" w:lineRule="auto"/>
+              <w:spacing w:after="0" w:line="240" w:lineRule="auto"/>
             </w:pPr>
             <w:r>
               <w:rPr>
@@ -10164,7 +10164,7 @@
           </w:tcPr>
           <w:p>
             <w:pPr>
-              <w:spacing w:after="20" w:line="240" w:lineRule="auto"/>
+              <w:spacing w:after="0" w:line="240" w:lineRule="auto"/>
             </w:pPr>
             <w:r>
               <w:rPr>
@@ -10178,7 +10178,7 @@
           </w:p>
           <w:p>
             <w:pPr>
-              <w:spacing w:after="30" w:line="252" w:lineRule="auto"/>
+              <w:spacing w:after="0" w:line="240" w:lineRule="auto"/>
             </w:pPr>
             <w:r>
               <w:rPr>
@@ -10210,7 +10210,7 @@
           </w:tcPr>
           <w:p>
             <w:pPr>
-              <w:spacing w:after="40" w:line="252" w:lineRule="auto"/>
+              <w:spacing w:after="0" w:line="240" w:lineRule="auto"/>
               <w:ind w:left="250" w:hanging="250"/>
             </w:pPr>
             <w:r>
@@ -10243,7 +10243,7 @@
           </w:p>
           <w:p>
             <w:pPr>
-              <w:spacing w:after="40" w:line="252" w:lineRule="auto"/>
+              <w:spacing w:after="0" w:line="240" w:lineRule="auto"/>
               <w:ind w:left="250" w:hanging="250"/>
             </w:pPr>
             <w:r>
@@ -10276,7 +10276,7 @@
           </w:p>
           <w:p>
             <w:pPr>
-              <w:spacing w:after="40" w:line="252" w:lineRule="auto"/>
+              <w:spacing w:after="0" w:line="240" w:lineRule="auto"/>
               <w:ind w:left="250" w:hanging="250"/>
             </w:pPr>
             <w:r>
@@ -10309,7 +10309,7 @@
           </w:p>
           <w:p>
             <w:pPr>
-              <w:spacing w:after="0" w:line="252" w:lineRule="auto"/>
+              <w:spacing w:after="0" w:line="240" w:lineRule="auto"/>
               <w:ind w:left="250" w:hanging="250"/>
             </w:pPr>
             <w:r>
@@ -10347,7 +10347,7 @@
           </w:tcPr>
           <w:p>
             <w:pPr>
-              <w:spacing w:after="0" w:line="252" w:lineRule="auto"/>
+              <w:spacing w:after="0" w:line="240" w:lineRule="auto"/>
             </w:pPr>
             <w:r>
               <w:rPr>
@@ -10369,7 +10369,7 @@
           </w:tcPr>
           <w:p>
             <w:pPr>
-              <w:spacing w:after="20" w:line="240" w:lineRule="auto"/>
+              <w:spacing w:after="0" w:line="240" w:lineRule="auto"/>
             </w:pPr>
             <w:r>
               <w:rPr>
@@ -10383,7 +10383,7 @@
           </w:p>
           <w:p>
             <w:pPr>
-              <w:spacing w:after="30" w:line="252" w:lineRule="auto"/>
+              <w:spacing w:after="0" w:line="240" w:lineRule="auto"/>
             </w:pPr>
             <w:r>
               <w:rPr>
@@ -10415,7 +10415,7 @@
           </w:tcPr>
           <w:p>
             <w:pPr>
-              <w:spacing w:after="40" w:line="252" w:lineRule="auto"/>
+              <w:spacing w:after="0" w:line="240" w:lineRule="auto"/>
               <w:ind w:left="250" w:hanging="250"/>
             </w:pPr>
             <w:r>
@@ -10448,7 +10448,7 @@
           </w:p>
           <w:p>
             <w:pPr>
-              <w:spacing w:after="40" w:line="252" w:lineRule="auto"/>
+              <w:spacing w:after="0" w:line="240" w:lineRule="auto"/>
               <w:ind w:left="250" w:hanging="250"/>
             </w:pPr>
             <w:r>
@@ -10481,7 +10481,7 @@
           </w:p>
           <w:p>
             <w:pPr>
-              <w:spacing w:after="40" w:line="252" w:lineRule="auto"/>
+              <w:spacing w:after="0" w:line="240" w:lineRule="auto"/>
               <w:ind w:left="250" w:hanging="250"/>
             </w:pPr>
             <w:r>
@@ -10514,7 +10514,7 @@
           </w:p>
           <w:p>
             <w:pPr>
-              <w:spacing w:after="0" w:line="252" w:lineRule="auto"/>
+              <w:spacing w:after="0" w:line="240" w:lineRule="auto"/>
               <w:ind w:left="250" w:hanging="250"/>
             </w:pPr>
             <w:r>
@@ -10552,7 +10552,7 @@
           </w:tcPr>
           <w:p>
             <w:pPr>
-              <w:spacing w:after="0" w:line="252" w:lineRule="auto"/>
+              <w:spacing w:after="0" w:line="240" w:lineRule="auto"/>
             </w:pPr>
             <w:r>
               <w:rPr>
@@ -10574,7 +10574,7 @@
           </w:tcPr>
           <w:p>
             <w:pPr>
-              <w:spacing w:after="20" w:line="240" w:lineRule="auto"/>
+              <w:spacing w:after="0" w:line="240" w:lineRule="auto"/>
             </w:pPr>
             <w:r>
               <w:rPr>
@@ -10588,7 +10588,7 @@
           </w:p>
           <w:p>
             <w:pPr>
-              <w:spacing w:after="30" w:line="252" w:lineRule="auto"/>
+              <w:spacing w:after="0" w:line="240" w:lineRule="auto"/>
             </w:pPr>
             <w:r>
               <w:rPr>
@@ -10620,7 +10620,7 @@
           </w:tcPr>
           <w:p>
             <w:pPr>
-              <w:spacing w:after="40" w:line="252" w:lineRule="auto"/>
+              <w:spacing w:after="0" w:line="240" w:lineRule="auto"/>
               <w:ind w:left="250" w:hanging="250"/>
             </w:pPr>
             <w:r>
@@ -10653,7 +10653,7 @@
           </w:p>
           <w:p>
             <w:pPr>
-              <w:spacing w:after="40" w:line="252" w:lineRule="auto"/>
+              <w:spacing w:after="0" w:line="240" w:lineRule="auto"/>
               <w:ind w:left="250" w:hanging="250"/>
             </w:pPr>
             <w:r>
@@ -10686,7 +10686,7 @@
           </w:p>
           <w:p>
             <w:pPr>
-              <w:spacing w:after="40" w:line="252" w:lineRule="auto"/>
+              <w:spacing w:after="0" w:line="240" w:lineRule="auto"/>
               <w:ind w:left="250" w:hanging="250"/>
             </w:pPr>
             <w:r>
@@ -10719,7 +10719,7 @@
           </w:p>
           <w:p>
             <w:pPr>
-              <w:spacing w:after="0" w:line="252" w:lineRule="auto"/>
+              <w:spacing w:after="0" w:line="240" w:lineRule="auto"/>
               <w:ind w:left="250" w:hanging="250"/>
             </w:pPr>
             <w:r>
@@ -10757,7 +10757,7 @@
           </w:tcPr>
           <w:p>
             <w:pPr>
-              <w:spacing w:after="0" w:line="252" w:lineRule="auto"/>
+              <w:spacing w:after="0" w:line="240" w:lineRule="auto"/>
             </w:pPr>
             <w:r>
               <w:rPr>
@@ -10779,7 +10779,7 @@
           </w:tcPr>
           <w:p>
             <w:pPr>
-              <w:spacing w:after="20" w:line="240" w:lineRule="auto"/>
+              <w:spacing w:after="0" w:line="240" w:lineRule="auto"/>
             </w:pPr>
             <w:r>
               <w:rPr>
@@ -10794,7 +10794,7 @@
           </w:p>
           <w:p>
             <w:pPr>
-              <w:spacing w:after="30" w:line="252" w:lineRule="auto"/>
+              <w:spacing w:after="0" w:line="240" w:lineRule="auto"/>
             </w:pPr>
             <w:r>
               <w:rPr>
@@ -10826,7 +10826,7 @@
           </w:tcPr>
           <w:p>
             <w:pPr>
-              <w:spacing w:after="40" w:line="252" w:lineRule="auto"/>
+              <w:spacing w:after="0" w:line="240" w:lineRule="auto"/>
               <w:ind w:left="250" w:hanging="250"/>
             </w:pPr>
             <w:r>
@@ -10859,7 +10859,7 @@
           </w:p>
           <w:p>
             <w:pPr>
-              <w:spacing w:after="40" w:line="252" w:lineRule="auto"/>
+              <w:spacing w:after="0" w:line="240" w:lineRule="auto"/>
               <w:ind w:left="250" w:hanging="250"/>
             </w:pPr>
             <w:r>
@@ -10892,7 +10892,7 @@
           </w:p>
           <w:p>
             <w:pPr>
-              <w:spacing w:after="40" w:line="252" w:lineRule="auto"/>
+              <w:spacing w:after="0" w:line="240" w:lineRule="auto"/>
               <w:ind w:left="250" w:hanging="250"/>
             </w:pPr>
             <w:r>
@@ -10925,7 +10925,7 @@
           </w:p>
           <w:p>
             <w:pPr>
-              <w:spacing w:after="0" w:line="252" w:lineRule="auto"/>
+              <w:spacing w:after="0" w:line="240" w:lineRule="auto"/>
               <w:ind w:left="250" w:hanging="250"/>
             </w:pPr>
             <w:r>
@@ -10963,7 +10963,7 @@
           </w:tcPr>
           <w:p>
             <w:pPr>
-              <w:spacing w:after="0" w:line="252" w:lineRule="auto"/>
+              <w:spacing w:after="0" w:line="240" w:lineRule="auto"/>
             </w:pPr>
             <w:r>
               <w:rPr>
@@ -10985,7 +10985,7 @@
           </w:tcPr>
           <w:p>
             <w:pPr>
-              <w:spacing w:after="20" w:line="240" w:lineRule="auto"/>
+              <w:spacing w:after="0" w:line="240" w:lineRule="auto"/>
             </w:pPr>
             <w:r>
               <w:rPr>
@@ -10999,7 +10999,7 @@
           </w:p>
           <w:p>
             <w:pPr>
-              <w:spacing w:after="30" w:line="252" w:lineRule="auto"/>
+              <w:spacing w:after="0" w:line="240" w:lineRule="auto"/>
             </w:pPr>
             <w:r>
               <w:rPr>
@@ -11031,7 +11031,7 @@
           </w:tcPr>
           <w:p>
             <w:pPr>
-              <w:spacing w:after="40" w:line="252" w:lineRule="auto"/>
+              <w:spacing w:after="0" w:line="240" w:lineRule="auto"/>
               <w:ind w:left="250" w:hanging="250"/>
             </w:pPr>
             <w:r>
@@ -11064,7 +11064,7 @@
           </w:p>
           <w:p>
             <w:pPr>
-              <w:spacing w:after="40" w:line="252" w:lineRule="auto"/>
+              <w:spacing w:after="0" w:line="240" w:lineRule="auto"/>
               <w:ind w:left="250" w:hanging="250"/>
             </w:pPr>
             <w:r>
@@ -11097,7 +11097,7 @@
           </w:p>
           <w:p>
             <w:pPr>
-              <w:spacing w:after="40" w:line="252" w:lineRule="auto"/>
+              <w:spacing w:after="0" w:line="240" w:lineRule="auto"/>
               <w:ind w:left="250" w:hanging="250"/>
             </w:pPr>
             <w:r>
@@ -11130,7 +11130,7 @@
           </w:p>
           <w:p>
             <w:pPr>
-              <w:spacing w:after="0" w:line="252" w:lineRule="auto"/>
+              <w:spacing w:after="0" w:line="240" w:lineRule="auto"/>
               <w:ind w:left="250" w:hanging="250"/>
             </w:pPr>
             <w:r>
@@ -11168,7 +11168,7 @@
           </w:tcPr>
           <w:p>
             <w:pPr>
-              <w:spacing w:after="0" w:line="252" w:lineRule="auto"/>
+              <w:spacing w:after="0" w:line="240" w:lineRule="auto"/>
             </w:pPr>
             <w:r>
               <w:rPr>
@@ -11185,7 +11185,7 @@
       <w:pPr>
         <w:keepNext/>
         <w:pageBreakBefore/>
-        <w:spacing w:after="16"/>
+        <w:spacing w:after="0"/>
       </w:pPr>
       <w:r>
         <w:rPr>
@@ -11203,7 +11203,7 @@
     <w:p>
       <w:pPr>
         <w:keepNext/>
-        <w:spacing w:after="60" w:line="240" w:lineRule="auto"/>
+        <w:spacing w:after="0" w:line="240" w:lineRule="auto"/>
       </w:pPr>
       <w:r>
         <w:rPr>
@@ -11217,7 +11217,7 @@
     <w:p>
       <w:pPr>
         <w:keepNext/>
-        <w:spacing w:after="110" w:line="264" w:lineRule="auto"/>
+        <w:spacing w:after="0" w:line="240" w:lineRule="auto"/>
       </w:pPr>
       <w:r>
         <w:rPr>
@@ -11233,7 +11233,7 @@
         <w:pBdr>
           <w:bottom w:val="single" w:sz="4" w:space="5" w:color="C9CDD2"/>
         </w:pBdr>
-        <w:spacing w:after="150" w:line="264" w:lineRule="auto"/>
+        <w:spacing w:after="0" w:line="240" w:lineRule="auto"/>
       </w:pPr>
     </w:p>
     <w:tbl>
@@ -11343,7 +11343,7 @@
           </w:tcPr>
           <w:p>
             <w:pPr>
-              <w:spacing w:after="20" w:line="240" w:lineRule="auto"/>
+              <w:spacing w:after="0" w:line="240" w:lineRule="auto"/>
             </w:pPr>
             <w:r>
               <w:rPr>
@@ -11357,7 +11357,7 @@
           </w:p>
           <w:p>
             <w:pPr>
-              <w:spacing w:after="30" w:line="252" w:lineRule="auto"/>
+              <w:spacing w:after="0" w:line="240" w:lineRule="auto"/>
             </w:pPr>
             <w:r>
               <w:rPr>
@@ -11389,7 +11389,7 @@
           </w:tcPr>
           <w:p>
             <w:pPr>
-              <w:spacing w:after="40" w:line="252" w:lineRule="auto"/>
+              <w:spacing w:after="0" w:line="240" w:lineRule="auto"/>
               <w:ind w:left="250" w:hanging="250"/>
             </w:pPr>
             <w:r>
@@ -11422,7 +11422,7 @@
           </w:p>
           <w:p>
             <w:pPr>
-              <w:spacing w:after="40" w:line="252" w:lineRule="auto"/>
+              <w:spacing w:after="0" w:line="240" w:lineRule="auto"/>
               <w:ind w:left="250" w:hanging="250"/>
             </w:pPr>
             <w:r>
@@ -11455,7 +11455,7 @@
           </w:p>
           <w:p>
             <w:pPr>
-              <w:spacing w:after="40" w:line="252" w:lineRule="auto"/>
+              <w:spacing w:after="0" w:line="240" w:lineRule="auto"/>
               <w:ind w:left="250" w:hanging="250"/>
             </w:pPr>
             <w:r>
@@ -11488,7 +11488,7 @@
           </w:p>
           <w:p>
             <w:pPr>
-              <w:spacing w:after="0" w:line="252" w:lineRule="auto"/>
+              <w:spacing w:after="0" w:line="240" w:lineRule="auto"/>
               <w:ind w:left="250" w:hanging="250"/>
             </w:pPr>
             <w:r>
@@ -11526,7 +11526,7 @@
           </w:tcPr>
           <w:p>
             <w:pPr>
-              <w:spacing w:after="0" w:line="252" w:lineRule="auto"/>
+              <w:spacing w:after="0" w:line="240" w:lineRule="auto"/>
             </w:pPr>
             <w:r>
               <w:rPr>
@@ -11548,7 +11548,7 @@
           </w:tcPr>
           <w:p>
             <w:pPr>
-              <w:spacing w:after="20" w:line="240" w:lineRule="auto"/>
+              <w:spacing w:after="0" w:line="240" w:lineRule="auto"/>
             </w:pPr>
             <w:r>
               <w:rPr>
@@ -11562,7 +11562,7 @@
           </w:p>
           <w:p>
             <w:pPr>
-              <w:spacing w:after="30" w:line="252" w:lineRule="auto"/>
+              <w:spacing w:after="0" w:line="240" w:lineRule="auto"/>
             </w:pPr>
             <w:r>
               <w:rPr>
@@ -11594,7 +11594,7 @@
           </w:tcPr>
           <w:p>
             <w:pPr>
-              <w:spacing w:after="40" w:line="252" w:lineRule="auto"/>
+              <w:spacing w:after="0" w:line="240" w:lineRule="auto"/>
               <w:ind w:left="250" w:hanging="250"/>
             </w:pPr>
             <w:r>
@@ -11627,7 +11627,7 @@
           </w:p>
           <w:p>
             <w:pPr>
-              <w:spacing w:after="40" w:line="252" w:lineRule="auto"/>
+              <w:spacing w:after="0" w:line="240" w:lineRule="auto"/>
               <w:ind w:left="250" w:hanging="250"/>
             </w:pPr>
             <w:r>
@@ -11660,7 +11660,7 @@
           </w:p>
           <w:p>
             <w:pPr>
-              <w:spacing w:after="40" w:line="252" w:lineRule="auto"/>
+              <w:spacing w:after="0" w:line="240" w:lineRule="auto"/>
               <w:ind w:left="250" w:hanging="250"/>
             </w:pPr>
             <w:r>
@@ -11693,7 +11693,7 @@
           </w:p>
           <w:p>
             <w:pPr>
-              <w:spacing w:after="0" w:line="252" w:lineRule="auto"/>
+              <w:spacing w:after="0" w:line="240" w:lineRule="auto"/>
               <w:ind w:left="250" w:hanging="250"/>
             </w:pPr>
             <w:r>
@@ -11731,7 +11731,7 @@
           </w:tcPr>
           <w:p>
             <w:pPr>
-              <w:spacing w:after="0" w:line="252" w:lineRule="auto"/>
+              <w:spacing w:after="0" w:line="240" w:lineRule="auto"/>
             </w:pPr>
             <w:r>
               <w:rPr>
@@ -11753,7 +11753,7 @@
           </w:tcPr>
           <w:p>
             <w:pPr>
-              <w:spacing w:after="20" w:line="240" w:lineRule="auto"/>
+              <w:spacing w:after="0" w:line="240" w:lineRule="auto"/>
             </w:pPr>
             <w:r>
               <w:rPr>
@@ -11767,7 +11767,7 @@
           </w:p>
           <w:p>
             <w:pPr>
-              <w:spacing w:after="30" w:line="252" w:lineRule="auto"/>
+              <w:spacing w:after="0" w:line="240" w:lineRule="auto"/>
             </w:pPr>
             <w:r>
               <w:rPr>
@@ -11799,7 +11799,7 @@
           </w:tcPr>
           <w:p>
             <w:pPr>
-              <w:spacing w:after="40" w:line="252" w:lineRule="auto"/>
+              <w:spacing w:after="0" w:line="240" w:lineRule="auto"/>
               <w:ind w:left="250" w:hanging="250"/>
             </w:pPr>
             <w:r>
@@ -11832,7 +11832,7 @@
           </w:p>
           <w:p>
             <w:pPr>
-              <w:spacing w:after="40" w:line="252" w:lineRule="auto"/>
+              <w:spacing w:after="0" w:line="240" w:lineRule="auto"/>
               <w:ind w:left="250" w:hanging="250"/>
             </w:pPr>
             <w:r>
@@ -11865,7 +11865,7 @@
           </w:p>
           <w:p>
             <w:pPr>
-              <w:spacing w:after="40" w:line="252" w:lineRule="auto"/>
+              <w:spacing w:after="0" w:line="240" w:lineRule="auto"/>
               <w:ind w:left="250" w:hanging="250"/>
             </w:pPr>
             <w:r>
@@ -11898,7 +11898,7 @@
           </w:p>
           <w:p>
             <w:pPr>
-              <w:spacing w:after="0" w:line="252" w:lineRule="auto"/>
+              <w:spacing w:after="0" w:line="240" w:lineRule="auto"/>
               <w:ind w:left="250" w:hanging="250"/>
             </w:pPr>
             <w:r>
@@ -11936,7 +11936,7 @@
           </w:tcPr>
           <w:p>
             <w:pPr>
-              <w:spacing w:after="0" w:line="252" w:lineRule="auto"/>
+              <w:spacing w:after="0" w:line="240" w:lineRule="auto"/>
             </w:pPr>
             <w:r>
               <w:rPr>
@@ -11958,7 +11958,7 @@
           </w:tcPr>
           <w:p>
             <w:pPr>
-              <w:spacing w:after="20" w:line="240" w:lineRule="auto"/>
+              <w:spacing w:after="0" w:line="240" w:lineRule="auto"/>
             </w:pPr>
             <w:r>
               <w:rPr>
@@ -11972,7 +11972,7 @@
           </w:p>
           <w:p>
             <w:pPr>
-              <w:spacing w:after="30" w:line="252" w:lineRule="auto"/>
+              <w:spacing w:after="0" w:line="240" w:lineRule="auto"/>
             </w:pPr>
             <w:r>
               <w:rPr>
@@ -12004,7 +12004,7 @@
           </w:tcPr>
           <w:p>
             <w:pPr>
-              <w:spacing w:after="40" w:line="252" w:lineRule="auto"/>
+              <w:spacing w:after="0" w:line="240" w:lineRule="auto"/>
               <w:ind w:left="250" w:hanging="250"/>
             </w:pPr>
             <w:r>
@@ -12037,7 +12037,7 @@
           </w:p>
           <w:p>
             <w:pPr>
-              <w:spacing w:after="40" w:line="252" w:lineRule="auto"/>
+              <w:spacing w:after="0" w:line="240" w:lineRule="auto"/>
               <w:ind w:left="250" w:hanging="250"/>
             </w:pPr>
             <w:r>
@@ -12070,7 +12070,7 @@
           </w:p>
           <w:p>
             <w:pPr>
-              <w:spacing w:after="40" w:line="252" w:lineRule="auto"/>
+              <w:spacing w:after="0" w:line="240" w:lineRule="auto"/>
               <w:ind w:left="250" w:hanging="250"/>
             </w:pPr>
             <w:r>
@@ -12103,7 +12103,7 @@
           </w:p>
           <w:p>
             <w:pPr>
-              <w:spacing w:after="0" w:line="252" w:lineRule="auto"/>
+              <w:spacing w:after="0" w:line="240" w:lineRule="auto"/>
               <w:ind w:left="250" w:hanging="250"/>
             </w:pPr>
             <w:r>
@@ -12141,7 +12141,7 @@
           </w:tcPr>
           <w:p>
             <w:pPr>
-              <w:spacing w:after="0" w:line="252" w:lineRule="auto"/>
+              <w:spacing w:after="0" w:line="240" w:lineRule="auto"/>
             </w:pPr>
             <w:r>
               <w:rPr>
@@ -12163,7 +12163,7 @@
           </w:tcPr>
           <w:p>
             <w:pPr>
-              <w:spacing w:after="20" w:line="240" w:lineRule="auto"/>
+              <w:spacing w:after="0" w:line="240" w:lineRule="auto"/>
             </w:pPr>
             <w:r>
               <w:rPr>
@@ -12177,7 +12177,7 @@
           </w:p>
           <w:p>
             <w:pPr>
-              <w:spacing w:after="30" w:line="252" w:lineRule="auto"/>
+              <w:spacing w:after="0" w:line="240" w:lineRule="auto"/>
             </w:pPr>
             <w:r>
               <w:rPr>
@@ -12209,7 +12209,7 @@
           </w:tcPr>
           <w:p>
             <w:pPr>
-              <w:spacing w:after="40" w:line="252" w:lineRule="auto"/>
+              <w:spacing w:after="0" w:line="240" w:lineRule="auto"/>
               <w:ind w:left="250" w:hanging="250"/>
             </w:pPr>
             <w:r>
@@ -12242,7 +12242,7 @@
           </w:p>
           <w:p>
             <w:pPr>
-              <w:spacing w:after="40" w:line="252" w:lineRule="auto"/>
+              <w:spacing w:after="0" w:line="240" w:lineRule="auto"/>
               <w:ind w:left="250" w:hanging="250"/>
             </w:pPr>
             <w:r>
@@ -12275,7 +12275,7 @@
           </w:p>
           <w:p>
             <w:pPr>
-              <w:spacing w:after="40" w:line="252" w:lineRule="auto"/>
+              <w:spacing w:after="0" w:line="240" w:lineRule="auto"/>
               <w:ind w:left="250" w:hanging="250"/>
             </w:pPr>
             <w:r>
@@ -12308,7 +12308,7 @@
           </w:p>
           <w:p>
             <w:pPr>
-              <w:spacing w:after="0" w:line="252" w:lineRule="auto"/>
+              <w:spacing w:after="0" w:line="240" w:lineRule="auto"/>
               <w:ind w:left="250" w:hanging="250"/>
             </w:pPr>
             <w:r>
@@ -12346,7 +12346,7 @@
           </w:tcPr>
           <w:p>
             <w:pPr>
-              <w:spacing w:after="0" w:line="252" w:lineRule="auto"/>
+              <w:spacing w:after="0" w:line="240" w:lineRule="auto"/>
             </w:pPr>
             <w:r>
               <w:rPr>
@@ -12363,7 +12363,7 @@
       <w:pPr>
         <w:keepNext/>
         <w:pageBreakBefore/>
-        <w:spacing w:after="16"/>
+        <w:spacing w:after="0"/>
       </w:pPr>
       <w:r>
         <w:rPr>
@@ -12381,7 +12381,7 @@
     <w:p>
       <w:pPr>
         <w:keepNext/>
-        <w:spacing w:after="60" w:line="240" w:lineRule="auto"/>
+        <w:spacing w:after="0" w:line="240" w:lineRule="auto"/>
       </w:pPr>
       <w:r>
         <w:rPr>
@@ -12395,7 +12395,7 @@
     <w:p>
       <w:pPr>
         <w:keepNext/>
-        <w:spacing w:after="110" w:line="264" w:lineRule="auto"/>
+        <w:spacing w:after="0" w:line="240" w:lineRule="auto"/>
       </w:pPr>
       <w:r>
         <w:rPr>
@@ -12411,7 +12411,7 @@
         <w:pBdr>
           <w:bottom w:val="single" w:sz="4" w:space="5" w:color="C9CDD2"/>
         </w:pBdr>
-        <w:spacing w:after="150" w:line="264" w:lineRule="auto"/>
+        <w:spacing w:after="0" w:line="240" w:lineRule="auto"/>
       </w:pPr>
     </w:p>
     <w:tbl>
@@ -12521,7 +12521,7 @@
           </w:tcPr>
           <w:p>
             <w:pPr>
-              <w:spacing w:after="20" w:line="240" w:lineRule="auto"/>
+              <w:spacing w:after="0" w:line="240" w:lineRule="auto"/>
             </w:pPr>
             <w:r>
               <w:rPr>
@@ -12535,7 +12535,7 @@
           </w:p>
           <w:p>
             <w:pPr>
-              <w:spacing w:after="30" w:line="252" w:lineRule="auto"/>
+              <w:spacing w:after="0" w:line="240" w:lineRule="auto"/>
             </w:pPr>
             <w:r>
               <w:rPr>
@@ -12567,7 +12567,7 @@
           </w:tcPr>
           <w:p>
             <w:pPr>
-              <w:spacing w:after="40" w:line="252" w:lineRule="auto"/>
+              <w:spacing w:after="0" w:line="240" w:lineRule="auto"/>
               <w:ind w:left="250" w:hanging="250"/>
             </w:pPr>
             <w:r>
@@ -12600,7 +12600,7 @@
           </w:p>
           <w:p>
             <w:pPr>
-              <w:spacing w:after="40" w:line="252" w:lineRule="auto"/>
+              <w:spacing w:after="0" w:line="240" w:lineRule="auto"/>
               <w:ind w:left="250" w:hanging="250"/>
             </w:pPr>
             <w:r>
@@ -12633,7 +12633,7 @@
           </w:p>
           <w:p>
             <w:pPr>
-              <w:spacing w:after="40" w:line="252" w:lineRule="auto"/>
+              <w:spacing w:after="0" w:line="240" w:lineRule="auto"/>
               <w:ind w:left="250" w:hanging="250"/>
             </w:pPr>
             <w:r>
@@ -12666,7 +12666,7 @@
           </w:p>
           <w:p>
             <w:pPr>
-              <w:spacing w:after="0" w:line="252" w:lineRule="auto"/>
+              <w:spacing w:after="0" w:line="240" w:lineRule="auto"/>
               <w:ind w:left="250" w:hanging="250"/>
             </w:pPr>
             <w:r>
@@ -12704,7 +12704,7 @@
           </w:tcPr>
           <w:p>
             <w:pPr>
-              <w:spacing w:after="0" w:line="252" w:lineRule="auto"/>
+              <w:spacing w:after="0" w:line="240" w:lineRule="auto"/>
             </w:pPr>
             <w:r>
               <w:rPr>
@@ -12726,7 +12726,7 @@
           </w:tcPr>
           <w:p>
             <w:pPr>
-              <w:spacing w:after="20" w:line="240" w:lineRule="auto"/>
+              <w:spacing w:after="0" w:line="240" w:lineRule="auto"/>
             </w:pPr>
             <w:r>
               <w:rPr>
@@ -12740,7 +12740,7 @@
           </w:p>
           <w:p>
             <w:pPr>
-              <w:spacing w:after="30" w:line="252" w:lineRule="auto"/>
+              <w:spacing w:after="0" w:line="240" w:lineRule="auto"/>
             </w:pPr>
             <w:r>
               <w:rPr>
@@ -12772,7 +12772,7 @@
           </w:tcPr>
           <w:p>
             <w:pPr>
-              <w:spacing w:after="40" w:line="252" w:lineRule="auto"/>
+              <w:spacing w:after="0" w:line="240" w:lineRule="auto"/>
               <w:ind w:left="250" w:hanging="250"/>
             </w:pPr>
             <w:r>
@@ -12805,7 +12805,7 @@
           </w:p>
           <w:p>
             <w:pPr>
-              <w:spacing w:after="40" w:line="252" w:lineRule="auto"/>
+              <w:spacing w:after="0" w:line="240" w:lineRule="auto"/>
               <w:ind w:left="250" w:hanging="250"/>
             </w:pPr>
             <w:r>
@@ -12838,7 +12838,7 @@
           </w:p>
           <w:p>
             <w:pPr>
-              <w:spacing w:after="40" w:line="252" w:lineRule="auto"/>
+              <w:spacing w:after="0" w:line="240" w:lineRule="auto"/>
               <w:ind w:left="250" w:hanging="250"/>
             </w:pPr>
             <w:r>
@@ -12871,7 +12871,7 @@
           </w:p>
           <w:p>
             <w:pPr>
-              <w:spacing w:after="0" w:line="252" w:lineRule="auto"/>
+              <w:spacing w:after="0" w:line="240" w:lineRule="auto"/>
               <w:ind w:left="250" w:hanging="250"/>
             </w:pPr>
             <w:r>
@@ -12909,7 +12909,7 @@
           </w:tcPr>
           <w:p>
             <w:pPr>
-              <w:spacing w:after="0" w:line="252" w:lineRule="auto"/>
+              <w:spacing w:after="0" w:line="240" w:lineRule="auto"/>
             </w:pPr>
             <w:r>
               <w:rPr>
@@ -12931,7 +12931,7 @@
           </w:tcPr>
           <w:p>
             <w:pPr>
-              <w:spacing w:after="20" w:line="240" w:lineRule="auto"/>
+              <w:spacing w:after="0" w:line="240" w:lineRule="auto"/>
             </w:pPr>
             <w:r>
               <w:rPr>
@@ -12945,7 +12945,7 @@
           </w:p>
           <w:p>
             <w:pPr>
-              <w:spacing w:after="30" w:line="252" w:lineRule="auto"/>
+              <w:spacing w:after="0" w:line="240" w:lineRule="auto"/>
             </w:pPr>
             <w:r>
               <w:rPr>
@@ -12977,7 +12977,7 @@
           </w:tcPr>
           <w:p>
             <w:pPr>
-              <w:spacing w:after="40" w:line="252" w:lineRule="auto"/>
+              <w:spacing w:after="0" w:line="240" w:lineRule="auto"/>
               <w:ind w:left="250" w:hanging="250"/>
             </w:pPr>
             <w:r>
@@ -13010,7 +13010,7 @@
           </w:p>
           <w:p>
             <w:pPr>
-              <w:spacing w:after="40" w:line="252" w:lineRule="auto"/>
+              <w:spacing w:after="0" w:line="240" w:lineRule="auto"/>
               <w:ind w:left="250" w:hanging="250"/>
             </w:pPr>
             <w:r>
@@ -13043,7 +13043,7 @@
           </w:p>
           <w:p>
             <w:pPr>
-              <w:spacing w:after="40" w:line="252" w:lineRule="auto"/>
+              <w:spacing w:after="0" w:line="240" w:lineRule="auto"/>
               <w:ind w:left="250" w:hanging="250"/>
             </w:pPr>
             <w:r>
@@ -13076,7 +13076,7 @@
           </w:p>
           <w:p>
             <w:pPr>
-              <w:spacing w:after="0" w:line="252" w:lineRule="auto"/>
+              <w:spacing w:after="0" w:line="240" w:lineRule="auto"/>
               <w:ind w:left="250" w:hanging="250"/>
             </w:pPr>
             <w:r>
@@ -13114,7 +13114,7 @@
           </w:tcPr>
           <w:p>
             <w:pPr>
-              <w:spacing w:after="0" w:line="252" w:lineRule="auto"/>
+              <w:spacing w:after="0" w:line="240" w:lineRule="auto"/>
             </w:pPr>
             <w:r>
               <w:rPr>
@@ -13136,7 +13136,7 @@
           </w:tcPr>
           <w:p>
             <w:pPr>
-              <w:spacing w:after="20" w:line="240" w:lineRule="auto"/>
+              <w:spacing w:after="0" w:line="240" w:lineRule="auto"/>
             </w:pPr>
             <w:r>
               <w:rPr>
@@ -13150,7 +13150,7 @@
           </w:p>
           <w:p>
             <w:pPr>
-              <w:spacing w:after="30" w:line="252" w:lineRule="auto"/>
+              <w:spacing w:after="0" w:line="240" w:lineRule="auto"/>
             </w:pPr>
             <w:r>
               <w:rPr>
@@ -13182,7 +13182,7 @@
           </w:tcPr>
           <w:p>
             <w:pPr>
-              <w:spacing w:after="40" w:line="252" w:lineRule="auto"/>
+              <w:spacing w:after="0" w:line="240" w:lineRule="auto"/>
               <w:ind w:left="250" w:hanging="250"/>
             </w:pPr>
             <w:r>
@@ -13215,7 +13215,7 @@
           </w:p>
           <w:p>
             <w:pPr>
-              <w:spacing w:after="40" w:line="252" w:lineRule="auto"/>
+              <w:spacing w:after="0" w:line="240" w:lineRule="auto"/>
               <w:ind w:left="250" w:hanging="250"/>
             </w:pPr>
             <w:r>
@@ -13248,7 +13248,7 @@
           </w:p>
           <w:p>
             <w:pPr>
-              <w:spacing w:after="40" w:line="252" w:lineRule="auto"/>
+              <w:spacing w:after="0" w:line="240" w:lineRule="auto"/>
               <w:ind w:left="250" w:hanging="250"/>
             </w:pPr>
             <w:r>
@@ -13281,7 +13281,7 @@
           </w:p>
           <w:p>
             <w:pPr>
-              <w:spacing w:after="0" w:line="252" w:lineRule="auto"/>
+              <w:spacing w:after="0" w:line="240" w:lineRule="auto"/>
               <w:ind w:left="250" w:hanging="250"/>
             </w:pPr>
             <w:r>
@@ -13319,7 +13319,7 @@
           </w:tcPr>
           <w:p>
             <w:pPr>
-              <w:spacing w:after="0" w:line="252" w:lineRule="auto"/>
+              <w:spacing w:after="0" w:line="240" w:lineRule="auto"/>
             </w:pPr>
             <w:r>
               <w:rPr>
@@ -13337,7 +13337,7 @@
       <w:headerReference w:type="default" r:id="rId8"/>
       <w:footerReference w:type="default" r:id="rId9"/>
       <w:pgSz w:w="12240" w:h="15840"/>
-      <w:pgMar w:top="893" w:right="1224" w:bottom="835" w:left="1512" w:header="432" w:footer="432" w:gutter="0"/>
+      <w:pgMar w:top="504" w:right="720" w:bottom="504" w:left="720" w:header="432" w:footer="432" w:gutter="0"/>
       <w:cols w:space="720"/>
       <w:docGrid w:linePitch="360"/>
     </w:sectPr>

</xml_diff>

<commit_message>
Sync current Reveal desktop masters and integrate fresh-check evidence in existing labs
</commit_message>
<xml_diff>
--- a/curriculum/reveal-documents/shared/teacher/fluency-skills-by-lesson.docx
+++ b/curriculum/reveal-documents/shared/teacher/fluency-skills-by-lesson.docx
@@ -21,6 +21,7 @@
     </w:p>
     <w:p>
       <w:pPr>
+        <w:pStyle w:val="Heading1"/>
         <w:keepNext/>
         <w:spacing w:after="0" w:line="240" w:lineRule="auto"/>
       </w:pPr>
@@ -469,7 +470,7 @@
                 <w:sz w:val="17"/>
                 <w:szCs w:val="17"/>
               </w:rPr>
-              <w:t>Multiply and divide by 10, 100, and 1000 by shifting the decimal</w:t>
+              <w:t>Multiply and divide by 10, 100, and 1000 using place value</w:t>
             </w:r>
           </w:p>
         </w:tc>
@@ -1026,7 +1027,7 @@
                 <w:sz w:val="17"/>
                 <w:szCs w:val="17"/>
               </w:rPr>
-              <w:t>Carried from Grade 5 and never retired; it returns in area, volume, and equations.</w:t>
+              <w:t>Grade 5 includes fraction multiplication and unit-fraction division; general fraction division is Grade 6 (6.NS.A.1).</w:t>
             </w:r>
           </w:p>
         </w:tc>
@@ -1053,6 +1054,7 @@
     </w:p>
     <w:p>
       <w:pPr>
+        <w:pStyle w:val="Heading1"/>
         <w:keepNext/>
         <w:spacing w:after="0" w:line="240" w:lineRule="auto"/>
       </w:pPr>
@@ -2242,7 +2244,7 @@
                 <w:sz w:val="18"/>
                 <w:szCs w:val="18"/>
               </w:rPr>
-              <w:t>Describe Data Using the Median (Session 2)</w:t>
+              <w:t>Median and Outliers / Comparing Distributions</w:t>
             </w:r>
           </w:p>
           <w:p>
@@ -2557,7 +2559,7 @@
                 <w:sz w:val="18"/>
                 <w:szCs w:val="18"/>
               </w:rPr>
-              <w:t>Multiply and divide by 10, 100, 1000 by shifting the decimal point</w:t>
+              <w:t>Multiply and divide by 10, 100, 1000 using place value point</w:t>
             </w:r>
             <w:r>
               <w:rPr>
@@ -3257,6 +3259,7 @@
     </w:p>
     <w:p>
       <w:pPr>
+        <w:pStyle w:val="Heading1"/>
         <w:keepNext/>
         <w:spacing w:after="0" w:line="240" w:lineRule="auto"/>
       </w:pPr>
@@ -4847,6 +4850,7 @@
     </w:p>
     <w:p>
       <w:pPr>
+        <w:pStyle w:val="Heading1"/>
         <w:keepNext/>
         <w:spacing w:after="0" w:line="240" w:lineRule="auto"/>
       </w:pPr>
@@ -4870,7 +4874,7 @@
           <w:sz w:val="19"/>
           <w:szCs w:val="19"/>
         </w:rPr>
-        <w:t>Move fluently among a fraction, a decimal, and a percent, and multiply or divide by 100 by shifting the decimal point. Benchmark percents (10%, 1%, 25%, 50%) do most of the work.</w:t>
+        <w:t>Move fluently among a fraction, a decimal, and a percent, and multiply or divide by 100 using place value point. Benchmark percents (10%, 1%, 25%, 50%) do most of the work.</w:t>
       </w:r>
     </w:p>
     <w:p>
@@ -5259,7 +5263,7 @@
                 <w:sz w:val="18"/>
                 <w:szCs w:val="18"/>
               </w:rPr>
-              <w:t>Multiply and divide by 100 by shifting the decimal point</w:t>
+              <w:t>Multiply and divide by 100 using place value point</w:t>
             </w:r>
             <w:r>
               <w:rPr>
@@ -5464,7 +5468,7 @@
                 <w:sz w:val="18"/>
                 <w:szCs w:val="18"/>
               </w:rPr>
-              <w:t>Find 10% of a number by shifting the decimal one place left</w:t>
+              <w:t>Find 10% of a number using place value one place left</w:t>
             </w:r>
             <w:r>
               <w:rPr>
@@ -6025,6 +6029,7 @@
     </w:p>
     <w:p>
       <w:pPr>
+        <w:pStyle w:val="Heading1"/>
         <w:keepNext/>
         <w:spacing w:after="0" w:line="240" w:lineRule="auto"/>
       </w:pPr>
@@ -6971,7 +6976,7 @@
                 <w:sz w:val="18"/>
                 <w:szCs w:val="18"/>
               </w:rPr>
-              <w:t>A 10 by 6 rectangle has a 3 by 2 square cut out. What area is left?</w:t>
+              <w:t>A 10 by 6 rectangle has a 3 by 2 rectangle cut out. What area is left?</w:t>
             </w:r>
           </w:p>
         </w:tc>
@@ -7819,6 +7824,7 @@
     </w:p>
     <w:p>
       <w:pPr>
+        <w:pStyle w:val="Heading1"/>
         <w:keepNext/>
         <w:spacing w:after="0" w:line="240" w:lineRule="auto"/>
       </w:pPr>
@@ -9613,6 +9619,7 @@
     </w:p>
     <w:p>
       <w:pPr>
+        <w:pStyle w:val="Heading1"/>
         <w:keepNext/>
         <w:spacing w:after="0" w:line="240" w:lineRule="auto"/>
       </w:pPr>
@@ -11202,6 +11209,7 @@
     </w:p>
     <w:p>
       <w:pPr>
+        <w:pStyle w:val="Heading1"/>
         <w:keepNext/>
         <w:spacing w:after="0" w:line="240" w:lineRule="auto"/>
       </w:pPr>
@@ -12380,6 +12388,7 @@
     </w:p>
     <w:p>
       <w:pPr>
+        <w:pStyle w:val="Heading1"/>
         <w:keepNext/>
         <w:spacing w:after="0" w:line="240" w:lineRule="auto"/>
       </w:pPr>
@@ -13424,7 +13433,84 @@
               <w:color w:val="5A5F66"/>
               <w:sz w:val="16"/>
             </w:rPr>
-            <w:t>1</w:t>
+            <w:t>Page </w:t>
+          </w:r>
+          <w:r>
+            <w:rPr>
+              <w:color w:val="5A5F66"/>
+              <w:sz w:val="16"/>
+            </w:rPr>
+            <w:fldChar w:fldCharType="end"/>
+          </w:r>
+          <w:r>
+            <w:rPr>
+              <w:color w:val="5A5F66"/>
+              <w:sz w:val="16"/>
+            </w:rPr>
+            <w:fldChar w:fldCharType="begin"/>
+          </w:r>
+          <w:r>
+            <w:rPr>
+              <w:color w:val="5A5F66"/>
+              <w:sz w:val="16"/>
+            </w:rPr>
+            <w:instrText xml:space="preserve"> PAGE </w:instrText>
+          </w:r>
+          <w:r>
+            <w:rPr>
+              <w:color w:val="5A5F66"/>
+              <w:sz w:val="16"/>
+            </w:rPr>
+            <w:fldChar w:fldCharType="separate"/>
+          </w:r>
+          <w:r>
+            <w:rPr>
+              <w:color w:val="5A5F66"/>
+              <w:sz w:val="16"/>
+            </w:rPr>
+            <w:t xml:space="preserve">1</w:t>
+          </w:r>
+          <w:r>
+            <w:rPr>
+              <w:color w:val="5A5F66"/>
+              <w:sz w:val="16"/>
+            </w:rPr>
+            <w:fldChar w:fldCharType="end"/>
+          </w:r>
+          <w:r>
+            <w:rPr>
+              <w:color w:val="5A5F66"/>
+              <w:sz w:val="16"/>
+            </w:rPr>
+            <w:t xml:space="preserve"> of </w:t>
+          </w:r>
+          <w:r>
+            <w:rPr>
+              <w:color w:val="5A5F66"/>
+              <w:sz w:val="16"/>
+            </w:rPr>
+            <w:fldChar w:fldCharType="begin"/>
+          </w:r>
+          <w:r>
+            <w:rPr>
+              <w:color w:val="5A5F66"/>
+              <w:sz w:val="16"/>
+            </w:rPr>
+            <w:instrText xml:space="preserve"> NUMPAGES </w:instrText>
+          </w:r>
+          <w:r>
+            <w:rPr>
+              <w:color w:val="5A5F66"/>
+              <w:sz w:val="16"/>
+            </w:rPr>
+            <w:fldChar w:fldCharType="separate"/>
+          </w:r>
+          <w:r>
+            <w:rPr>
+              <w:color w:val="5A5F66"/>
+              <w:sz w:val="16"/>
+            </w:rPr>
+            <w:t xml:space="preserve">1</w:t>
           </w:r>
           <w:r>
             <w:rPr>
@@ -14078,49 +14164,20 @@
   <w:style w:type="paragraph" w:styleId="Heading1">
     <w:name w:val="heading 1"/>
     <w:basedOn w:val="Normal"/>
-    <w:next w:val="Normal"/>
-    <w:link w:val="Heading1Char"/>
-    <w:uiPriority w:val="9"/>
-    <w:qFormat/>
-    <w:rsid w:val="00FC693F"/>
     <w:pPr>
-      <w:keepNext/>
-      <w:keepLines/>
-      <w:spacing w:before="480" w:after="0"/>
       <w:outlineLvl w:val="0"/>
+      <w:keepNext w:val="0"/>
+      <w:keepLines w:val="0"/>
     </w:pPr>
-    <w:rPr>
-      <w:rFonts w:asciiTheme="majorHAnsi" w:eastAsiaTheme="majorEastAsia" w:hAnsiTheme="majorHAnsi" w:cstheme="majorBidi"/>
-      <w:b/>
-      <w:bCs/>
-      <w:color w:val="365F91" w:themeColor="accent1" w:themeShade="BF"/>
-      <w:sz w:val="28"/>
-      <w:szCs w:val="28"/>
-    </w:rPr>
   </w:style>
   <w:style w:type="paragraph" w:styleId="Heading2">
     <w:name w:val="heading 2"/>
     <w:basedOn w:val="Normal"/>
-    <w:next w:val="Normal"/>
-    <w:link w:val="Heading2Char"/>
-    <w:uiPriority w:val="9"/>
-    <w:unhideWhenUsed/>
-    <w:qFormat/>
-    <w:rsid w:val="00FC693F"/>
     <w:pPr>
-      <w:keepNext/>
-      <w:keepLines/>
-      <w:spacing w:before="200" w:after="0"/>
       <w:outlineLvl w:val="1"/>
+      <w:keepNext w:val="0"/>
+      <w:keepLines w:val="0"/>
     </w:pPr>
-    <w:rPr>
-      <w:rFonts w:asciiTheme="majorHAnsi" w:eastAsiaTheme="majorEastAsia" w:hAnsiTheme="majorHAnsi" w:cstheme="majorBidi"/>
-      <w:b/>
-      <w:bCs/>
-      <w:color w:val="4F81BD" w:themeColor="accent1"/>
-      <w:sz w:val="26"/>
-      <w:szCs w:val="26"/>
-    </w:rPr>
   </w:style>
   <w:style w:type="paragraph" w:styleId="Heading3">
     <w:name w:val="heading 3"/>

</xml_diff>